<commit_message>
File > Plug-ins... opens Preferences on the Plug-ins tab
Co-Authored-By: Claude Opus 5.5 <noreply@anthropic.com>
</commit_message>
<xml_diff>
--- a/GitHub/docs/User_Manual.docx
+++ b/GitHub/docs/User_Manual.docx
@@ -6447,6 +6447,22 @@
       </w:pPr>
       <w:r>
         <w:t xml:space="preserve">Open File &gt; Preferences (Ctrl+P). The dialog has seven tabs: Download Path, General, File Handling, Automation, Mapping, Custom Button and Plug-ins.</w:t>
+      </w:r>
+      <w:r>
+        <w:t xml:space="preserve"> </w:t>
+      </w:r>
+      <w:r>
+        <w:rPr>
+          <w:b/>
+          <w:bCs/>
+        </w:rPr>
+        <w:t xml:space="preserve">File &gt; Plug-ins…</w:t>
+      </w:r>
+      <w:r>
+        <w:t xml:space="preserve"> </w:t>
+      </w:r>
+      <w:r>
+        <w:t xml:space="preserve">opens it directly on the Plug-ins tab.</w:t>
       </w:r>
     </w:p>
     <w:p>

</xml_diff>

<commit_message>
Manuals: user profiles keep the plug-in settings
Tested: a saved profile restores the plug-in on/off state, its order, its
values and the download path.

Co-Authored-By: Claude Opus 5.5 <noreply@anthropic.com>
</commit_message>
<xml_diff>
--- a/GitHub/docs/User_Manual.docx
+++ b/GitHub/docs/User_Manual.docx
@@ -7589,6 +7589,31 @@
       </w:r>
       <w:r>
         <w:t xml:space="preserve">removes one.</w:t>
+      </w:r>
+    </w:p>
+    <w:p>
+      <w:pPr>
+        <w:pStyle w:val="Compact"/>
+        <w:numPr>
+          <w:ilvl w:val="0"/>
+          <w:numId w:val="1016"/>
+        </w:numPr>
+      </w:pPr>
+      <w:r>
+        <w:t xml:space="preserve">A profile holds all preferences, including the</w:t>
+      </w:r>
+      <w:r>
+        <w:t xml:space="preserve"> </w:t>
+      </w:r>
+      <w:r>
+        <w:rPr>
+          <w:b/>
+          <w:bCs/>
+        </w:rPr>
+        <w:t xml:space="preserve">plug-ins</w:t>
+      </w:r>
+      <w:r>
+        <w:t xml:space="preserve">: which are switched on, their order, and the values entered in a plug-in’s window (with the download path it set). Loading a profile switches the plug-ins on or off as saved; a plug-in library that is missing on this computer is switched off with a message.</w:t>
       </w:r>
     </w:p>
     <w:p>

</xml_diff>

<commit_message>
Save User Profile: list of saved profiles, name of the profile in use filled in
The dialog lists the saved profiles (click one to save over it, double-click
saves at once) and suggests the profile loaded or saved last ([General]
ProfileName). Saving over a profile asks first and writes a new file, so no
old keys are left behind.

Co-Authored-By: Claude Opus 5.5 <noreply@anthropic.com>
</commit_message>
<xml_diff>
--- a/GitHub/docs/User_Manual.docx
+++ b/GitHub/docs/User_Manual.docx
@@ -7589,6 +7589,44 @@
       </w:r>
       <w:r>
         <w:t xml:space="preserve">removes one.</w:t>
+      </w:r>
+    </w:p>
+    <w:p>
+      <w:pPr>
+        <w:pStyle w:val="Compact"/>
+        <w:numPr>
+          <w:ilvl w:val="0"/>
+          <w:numId w:val="1016"/>
+        </w:numPr>
+      </w:pPr>
+      <w:r>
+        <w:rPr>
+          <w:b/>
+          <w:bCs/>
+        </w:rPr>
+        <w:t xml:space="preserve">Save</w:t>
+      </w:r>
+      <w:r>
+        <w:t xml:space="preserve"> </w:t>
+      </w:r>
+      <w:r>
+        <w:t xml:space="preserve">lists the saved profiles and fills in the name of the profile in use (the one loaded or saved last). Click</w:t>
+      </w:r>
+      <w:r>
+        <w:t xml:space="preserve"> </w:t>
+      </w:r>
+      <w:r>
+        <w:rPr>
+          <w:b/>
+          <w:bCs/>
+        </w:rPr>
+        <w:t xml:space="preserve">Save</w:t>
+      </w:r>
+      <w:r>
+        <w:t xml:space="preserve"> </w:t>
+      </w:r>
+      <w:r>
+        <w:t xml:space="preserve">to update that profile, click another profile in the list (double-click saves at once) to save over it, or type a new name. Saving over a profile asks for confirmation first.</w:t>
       </w:r>
     </w:p>
     <w:p>

</xml_diff>

<commit_message>
Fix: removed plug-in library stayed in the list; unknown entries showed the JPEG resolution text
At start-up, [Plugins] entries that are neither built-in nor a found library
are removed (logged; their values stay in [PluginOpts] for a reinstall).
The Plug-ins tab no longer falls back to the JPEG resolution description.

Co-Authored-By: Claude Opus 5.5 <noreply@anthropic.com>
</commit_message>
<xml_diff>
--- a/GitHub/docs/User_Manual.docx
+++ b/GitHub/docs/User_Manual.docx
@@ -7319,7 +7319,22 @@
         <w:t xml:space="preserve"> </w:t>
       </w:r>
       <w:r>
-        <w:t xml:space="preserve">only when you trust where the file came from, because a library runs with your rights. If a library cannot be loaded (for example a 32-bit or a Linux file on Windows), the program says why and switches it off.</w:t>
+        <w:t xml:space="preserve">only when you trust where the file came from, because a library runs with your rights. If a library cannot be loaded (for example a 32-bit or a Linux file on Windows), the program says why and switches it off. To remove a plug-in, delete its file from the</w:t>
+      </w:r>
+      <w:r>
+        <w:t xml:space="preserve"> </w:t>
+      </w:r>
+      <w:r>
+        <w:rPr>
+          <w:rStyle w:val="VerbatimChar"/>
+        </w:rPr>
+        <w:t xml:space="preserve">plugins</w:t>
+      </w:r>
+      <w:r>
+        <w:t xml:space="preserve"> </w:t>
+      </w:r>
+      <w:r>
+        <w:t xml:space="preserve">folder: at the next start it leaves the list. Its values are kept, so they are back if you install it again.</w:t>
       </w:r>
     </w:p>
     <w:p>

</xml_diff>

<commit_message>
Download Selected and Download All buttons; plug-in download path keeps its project folders
- The Download button is now Download Selected (only selected files) and a new
  Download All button downloads every shown file. Automation is unchanged.
- Bug: a download path holding only a plug-in type folder ({UAS.Media}) counted
  as the plug-in's layout, so files went straight into JPG, MP4 ... folders.
  The layout now has to hold the first DestTemplate token; otherwise the window
  (on opening, or after Destination folder...) puts the plug-in's layout back.
- Build 201.

Co-Authored-By: Claude Opus 5.5 <noreply@anthropic.com>
</commit_message>
<xml_diff>
--- a/GitHub/docs/User_Manual.docx
+++ b/GitHub/docs/User_Manual.docx
@@ -1510,7 +1510,20 @@
                 <w:b/>
                 <w:bCs/>
               </w:rPr>
-              <w:t xml:space="preserve">Download</w:t>
+              <w:t xml:space="preserve">Download Selected</w:t>
+            </w:r>
+            <w:r>
+              <w:t xml:space="preserve">,</w:t>
+            </w:r>
+            <w:r>
+              <w:t xml:space="preserve"> </w:t>
+            </w:r>
+            <w:r>
+              <w:rPr>
+                <w:b/>
+                <w:bCs/>
+              </w:rPr>
+              <w:t xml:space="preserve">Download All</w:t>
             </w:r>
             <w:r>
               <w:t xml:space="preserve">, and an optional</w:t>
@@ -1845,10 +1858,26 @@
           <w:b/>
           <w:bCs/>
         </w:rPr>
-        <w:t xml:space="preserve">Download</w:t>
-      </w:r>
-      <w:r>
-        <w:t xml:space="preserve">. Each file is copied, then read back and compared with the original. The status line reports the result.</w:t>
+        <w:t xml:space="preserve">Download All</w:t>
+      </w:r>
+      <w:r>
+        <w:t xml:space="preserve"> </w:t>
+      </w:r>
+      <w:r>
+        <w:t xml:space="preserve">(or select files and click</w:t>
+      </w:r>
+      <w:r>
+        <w:t xml:space="preserve"> </w:t>
+      </w:r>
+      <w:r>
+        <w:rPr>
+          <w:b/>
+          <w:bCs/>
+        </w:rPr>
+        <w:t xml:space="preserve">Download Selected</w:t>
+      </w:r>
+      <w:r>
+        <w:t xml:space="preserve">). Each file is copied, then read back and compared with the original. The status line reports the result.</w:t>
       </w:r>
     </w:p>
     <w:p>
@@ -3935,23 +3964,7 @@
         <w:t xml:space="preserve"> </w:t>
       </w:r>
       <w:r>
-        <w:t xml:space="preserve">It shows the status. The options only decide what</w:t>
-      </w:r>
-      <w:r>
-        <w:t xml:space="preserve"> </w:t>
-      </w:r>
-      <w:r>
-        <w:rPr>
-          <w:b/>
-          <w:bCs/>
-        </w:rPr>
-        <w:t xml:space="preserve">Download</w:t>
-      </w:r>
-      <w:r>
-        <w:t xml:space="preserve"> </w:t>
-      </w:r>
-      <w:r>
-        <w:t xml:space="preserve">does with those files (skip them, download them numbered, or download them only when the name is free).</w:t>
+        <w:t xml:space="preserve">It shows the status. The options only decide what a download does with those files (skip them, download them numbered, or download them only when the name is free).</w:t>
       </w:r>
     </w:p>
     <w:p>
@@ -5733,30 +5746,6 @@
     </w:p>
     <w:p>
       <w:pPr>
-        <w:pStyle w:val="FirstParagraph"/>
-      </w:pPr>
-      <w:r>
-        <w:t xml:space="preserve">Click</w:t>
-      </w:r>
-      <w:r>
-        <w:t xml:space="preserve"> </w:t>
-      </w:r>
-      <w:r>
-        <w:rPr>
-          <w:b/>
-          <w:bCs/>
-        </w:rPr>
-        <w:t xml:space="preserve">Download</w:t>
-      </w:r>
-      <w:r>
-        <w:t xml:space="preserve"> </w:t>
-      </w:r>
-      <w:r>
-        <w:t xml:space="preserve">(or right-click &gt; Download selected file(s)). For each file the program:</w:t>
-      </w:r>
-    </w:p>
-    <w:p>
-      <w:pPr>
         <w:pStyle w:val="Compact"/>
         <w:numPr>
           <w:ilvl w:val="0"/>
@@ -5764,7 +5753,17 @@
         </w:numPr>
       </w:pPr>
       <w:r>
-        <w:t xml:space="preserve">creates the destination folder if needed,</w:t>
+        <w:rPr>
+          <w:b/>
+          <w:bCs/>
+        </w:rPr>
+        <w:t xml:space="preserve">Download Selected</w:t>
+      </w:r>
+      <w:r>
+        <w:t xml:space="preserve"> </w:t>
+      </w:r>
+      <w:r>
+        <w:t xml:space="preserve">(or right-click &gt; Download selected file(s)) downloads only the selected files. It is available when at least one selected file still needs downloading.</w:t>
       </w:r>
     </w:p>
     <w:p>
@@ -5776,7 +5775,17 @@
         </w:numPr>
       </w:pPr>
       <w:r>
-        <w:t xml:space="preserve">copies the file,</w:t>
+        <w:rPr>
+          <w:b/>
+          <w:bCs/>
+        </w:rPr>
+        <w:t xml:space="preserve">Download All</w:t>
+      </w:r>
+      <w:r>
+        <w:t xml:space="preserve"> </w:t>
+      </w:r>
+      <w:r>
+        <w:t xml:space="preserve">downloads every file shown in the window, whatever is selected (files hidden by View &gt; File Types or the Show options are not included).</w:t>
       </w:r>
     </w:p>
     <w:p>
@@ -5788,54 +5797,7 @@
         </w:numPr>
       </w:pPr>
       <w:r>
-        <w:rPr>
-          <w:b/>
-          <w:bCs/>
-        </w:rPr>
-        <w:t xml:space="preserve">verifies</w:t>
-      </w:r>
-      <w:r>
-        <w:t xml:space="preserve"> </w:t>
-      </w:r>
-      <w:r>
-        <w:t xml:space="preserve">it by reading the copy back and comparing a checksum (one automatic retry if it differs),</w:t>
-      </w:r>
-    </w:p>
-    <w:p>
-      <w:pPr>
-        <w:pStyle w:val="Compact"/>
-        <w:numPr>
-          <w:ilvl w:val="0"/>
-          <w:numId w:val="1012"/>
-        </w:numPr>
-      </w:pPr>
-      <w:r>
-        <w:t xml:space="preserve">optionally makes a</w:t>
-      </w:r>
-      <w:r>
-        <w:t xml:space="preserve"> </w:t>
-      </w:r>
-      <w:r>
-        <w:rPr>
-          <w:b/>
-          <w:bCs/>
-        </w:rPr>
-        <w:t xml:space="preserve">backup copy</w:t>
-      </w:r>
-      <w:r>
-        <w:t xml:space="preserve">, and</w:t>
-      </w:r>
-    </w:p>
-    <w:p>
-      <w:pPr>
-        <w:pStyle w:val="Compact"/>
-        <w:numPr>
-          <w:ilvl w:val="0"/>
-          <w:numId w:val="1012"/>
-        </w:numPr>
-      </w:pPr>
-      <w:r>
-        <w:t xml:space="preserve">applies the options you chose: capture time as the file date, read-only, lower-case names, lossless auto-rotation, author/copyright, IPTC/XMP data, EXIF text file.</w:t>
+        <w:t xml:space="preserve">Automation (Preferences &gt; Automation) downloads the selected files, or all files when nothing is selected.</w:t>
       </w:r>
     </w:p>
     <w:p>
@@ -5843,297 +5805,7 @@
         <w:pStyle w:val="FirstParagraph"/>
       </w:pPr>
       <w:r>
-        <w:t xml:space="preserve">A progress window shows the file being copied and has a</w:t>
-      </w:r>
-      <w:r>
-        <w:t xml:space="preserve"> </w:t>
-      </w:r>
-      <w:r>
-        <w:rPr>
-          <w:b/>
-          <w:bCs/>
-        </w:rPr>
-        <w:t xml:space="preserve">Cancel</w:t>
-      </w:r>
-      <w:r>
-        <w:t xml:space="preserve"> </w:t>
-      </w:r>
-      <w:r>
-        <w:t xml:space="preserve">button; a cancelled download can simply be started again, and files already copied are recognized as downloaded.</w:t>
-      </w:r>
-    </w:p>
-    <w:p>
-      <w:pPr>
-        <w:pStyle w:val="BodyText"/>
-      </w:pPr>
-      <w:r>
-        <w:rPr>
-          <w:b/>
-          <w:bCs/>
-        </w:rPr>
-        <w:t xml:space="preserve">Verify every copy</w:t>
-      </w:r>
-      <w:r>
-        <w:t xml:space="preserve"> </w:t>
-      </w:r>
-      <w:r>
-        <w:t xml:space="preserve">is on by default (Preferences &gt; Download Path).</w:t>
-      </w:r>
-      <w:r>
-        <w:t xml:space="preserve"> </w:t>
-      </w:r>
-      <w:r>
-        <w:rPr>
-          <w:b/>
-          <w:bCs/>
-        </w:rPr>
-        <w:t xml:space="preserve">Also save a second copy to a backup folder</w:t>
-      </w:r>
-      <w:r>
-        <w:t xml:space="preserve"> </w:t>
-      </w:r>
-      <w:r>
-        <w:t xml:space="preserve">makes another copy, using the same patterns, from the verified download before any rotation or metadata is applied. A file whose backup failed is never offered for deletion.</w:t>
-      </w:r>
-    </w:p>
-    <w:p>
-      <w:pPr>
-        <w:pStyle w:val="BodyText"/>
-      </w:pPr>
-      <w:r>
-        <w:rPr>
-          <w:b/>
-          <w:bCs/>
-        </w:rPr>
-        <w:t xml:space="preserve">Auto-rotate.</w:t>
-      </w:r>
-      <w:r>
-        <w:t xml:space="preserve"> </w:t>
-      </w:r>
-      <w:r>
-        <w:t xml:space="preserve">Downloaded JPEGs are turned upright according to their EXIF orientation without recompressing them (lossless). Up to 15 rows or columns that do not fill a block may be trimmed at one edge, as the standard tool</w:t>
-      </w:r>
-      <w:r>
-        <w:t xml:space="preserve"> </w:t>
-      </w:r>
-      <w:r>
-        <w:rPr>
-          <w:rStyle w:val="VerbatimChar"/>
-        </w:rPr>
-        <w:t xml:space="preserve">jpegtran -trim</w:t>
-      </w:r>
-      <w:r>
-        <w:t xml:space="preserve"> </w:t>
-      </w:r>
-      <w:r>
-        <w:t xml:space="preserve">does. The thumbnails and viewer always show pictures upright regardless of this option.</w:t>
-      </w:r>
-    </w:p>
-    <w:p>
-      <w:pPr>
-        <w:pStyle w:val="BodyText"/>
-      </w:pPr>
-      <w:r>
-        <w:rPr>
-          <w:b/>
-          <w:bCs/>
-        </w:rPr>
-        <w:t xml:space="preserve">Other options</w:t>
-      </w:r>
-      <w:r>
-        <w:t xml:space="preserve"> </w:t>
-      </w:r>
-      <w:r>
-        <w:t xml:space="preserve">(Preferences &gt; File Handling): Save files as read-only; Preserve read-only status; Use image capture time for file timestamp; Convert file name to lower case; Lower case file extensions; Rename</w:t>
-      </w:r>
-      <w:r>
-        <w:t xml:space="preserve"> </w:t>
-      </w:r>
-      <w:r>
-        <w:rPr>
-          <w:rStyle w:val="VerbatimChar"/>
-        </w:rPr>
-        <w:t xml:space="preserve">.jpe</w:t>
-      </w:r>
-      <w:r>
-        <w:t xml:space="preserve"> </w:t>
-      </w:r>
-      <w:r>
-        <w:t xml:space="preserve">to</w:t>
-      </w:r>
-      <w:r>
-        <w:t xml:space="preserve"> </w:t>
-      </w:r>
-      <w:r>
-        <w:rPr>
-          <w:rStyle w:val="VerbatimChar"/>
-        </w:rPr>
-        <w:t xml:space="preserve">.jpg</w:t>
-      </w:r>
-      <w:r>
-        <w:t xml:space="preserve">; Save Lightroom previews (</w:t>
-      </w:r>
-      <w:r>
-        <w:rPr>
-          <w:rStyle w:val="VerbatimChar"/>
-        </w:rPr>
-        <w:t xml:space="preserve">.lrprev</w:t>
-      </w:r>
-      <w:r>
-        <w:t xml:space="preserve">) as</w:t>
-      </w:r>
-      <w:r>
-        <w:t xml:space="preserve"> </w:t>
-      </w:r>
-      <w:r>
-        <w:rPr>
-          <w:rStyle w:val="VerbatimChar"/>
-        </w:rPr>
-        <w:t xml:space="preserve">.jpg</w:t>
-      </w:r>
-      <w:r>
-        <w:t xml:space="preserve">, optionally keeping both; Generate text file containing EXIF shooting data; Add IPTC/XMP data (a</w:t>
-      </w:r>
-      <w:r>
-        <w:t xml:space="preserve"> </w:t>
-      </w:r>
-      <w:r>
-        <w:rPr>
-          <w:rStyle w:val="VerbatimChar"/>
-        </w:rPr>
-        <w:t xml:space="preserve">.xmp</w:t>
-      </w:r>
-      <w:r>
-        <w:t xml:space="preserve"> </w:t>
-      </w:r>
-      <w:r>
-        <w:t xml:space="preserve">sidecar is written; see Edit &gt; IPTC/XMP Data); Add author and copyright to EXIF of downloaded JPEGs (only where those fields are empty).</w:t>
-      </w:r>
-    </w:p>
-    <w:p>
-      <w:pPr>
-        <w:pStyle w:val="BodyText"/>
-      </w:pPr>
-      <w:r>
-        <w:rPr>
-          <w:b/>
-          <w:bCs/>
-        </w:rPr>
-        <w:t xml:space="preserve">Custom button.</w:t>
-      </w:r>
-      <w:r>
-        <w:t xml:space="preserve"> </w:t>
-      </w:r>
-      <w:r>
-        <w:t xml:space="preserve">Preferences &gt; Custom button adds a button with your own caption that runs a program. In the command line</w:t>
-      </w:r>
-      <w:r>
-        <w:t xml:space="preserve"> </w:t>
-      </w:r>
-      <w:r>
-        <w:rPr>
-          <w:rStyle w:val="VerbatimChar"/>
-        </w:rPr>
-        <w:t xml:space="preserve">%f</w:t>
-      </w:r>
-      <w:r>
-        <w:t xml:space="preserve"> </w:t>
-      </w:r>
-      <w:r>
-        <w:t xml:space="preserve">is the file and</w:t>
-      </w:r>
-      <w:r>
-        <w:t xml:space="preserve"> </w:t>
-      </w:r>
-      <w:r>
-        <w:rPr>
-          <w:rStyle w:val="VerbatimChar"/>
-        </w:rPr>
-        <w:t xml:space="preserve">%d</w:t>
-      </w:r>
-      <w:r>
-        <w:t xml:space="preserve"> </w:t>
-      </w:r>
-      <w:r>
-        <w:t xml:space="preserve">its directory.</w:t>
-      </w:r>
-    </w:p>
-    <w:p>
-      <w:pPr>
-        <w:pStyle w:val="Heading2"/>
-      </w:pPr>
-      <w:bookmarkStart w:id="23" w:name="_fcb1a6fe1f2ffd99d6b38a945e0ca912e43900a"/>
-      <w:r>
-        <w:t xml:space="preserve">10. Deleting from the card</w:t>
-      </w:r>
-      <w:bookmarkEnd w:id="23"/>
-    </w:p>
-    <w:p>
-      <w:pPr>
-        <w:pStyle w:val="FirstParagraph"/>
-      </w:pPr>
-      <w:r>
-        <w:rPr>
-          <w:b/>
-          <w:bCs/>
-        </w:rPr>
-        <w:t xml:space="preserve">Delete</w:t>
-      </w:r>
-      <w:r>
-        <w:t xml:space="preserve"> </w:t>
-      </w:r>
-      <w:r>
-        <w:t xml:space="preserve">(the button, or right-click &gt; Delete selected file(s) from source) removes selected pictures from the</w:t>
-      </w:r>
-      <w:r>
-        <w:t xml:space="preserve"> </w:t>
-      </w:r>
-      <w:r>
-        <w:rPr>
-          <w:i/>
-          <w:iCs/>
-        </w:rPr>
-        <w:t xml:space="preserve">source</w:t>
-      </w:r>
-      <w:r>
-        <w:t xml:space="preserve"> </w:t>
-      </w:r>
-      <w:r>
-        <w:t xml:space="preserve">– but only those that are marked</w:t>
-      </w:r>
-      <w:r>
-        <w:t xml:space="preserve"> </w:t>
-      </w:r>
-      <w:r>
-        <w:rPr>
-          <w:b/>
-          <w:bCs/>
-        </w:rPr>
-        <w:t xml:space="preserve">Already downloaded</w:t>
-      </w:r>
-      <w:r>
-        <w:t xml:space="preserve"> </w:t>
-      </w:r>
-      <w:r>
-        <w:t xml:space="preserve">and really exist in the destination (and, if a backup is on, in the backup). Anything else is left alone.</w:t>
-      </w:r>
-    </w:p>
-    <w:p>
-      <w:pPr>
-        <w:pStyle w:val="BodyText"/>
-      </w:pPr>
-      <w:r>
-        <w:rPr>
-          <w:b/>
-          <w:bCs/>
-        </w:rPr>
-        <w:t xml:space="preserve">Safe delete</w:t>
-      </w:r>
-      <w:r>
-        <w:t xml:space="preserve"> </w:t>
-      </w:r>
-      <w:r>
-        <w:t xml:space="preserve">is on by default (Preferences &gt; Automation):</w:t>
+        <w:t xml:space="preserve">For each file the program:</w:t>
       </w:r>
     </w:p>
     <w:p>
@@ -6145,23 +5817,7 @@
         </w:numPr>
       </w:pPr>
       <w:r>
-        <w:t xml:space="preserve">On your computer’s own disks, deleted files go to the</w:t>
-      </w:r>
-      <w:r>
-        <w:t xml:space="preserve"> </w:t>
-      </w:r>
-      <w:r>
-        <w:rPr>
-          <w:b/>
-          <w:bCs/>
-        </w:rPr>
-        <w:t xml:space="preserve">Recycle Bin</w:t>
-      </w:r>
-      <w:r>
-        <w:t xml:space="preserve"> </w:t>
-      </w:r>
-      <w:r>
-        <w:t xml:space="preserve">(Linux: the trash).</w:t>
+        <w:t xml:space="preserve">creates the destination folder if needed,</w:t>
       </w:r>
     </w:p>
     <w:p>
@@ -6173,22 +5829,7 @@
         </w:numPr>
       </w:pPr>
       <w:r>
-        <w:t xml:space="preserve">On cards, USB drives and network drives, they are moved to a hidden folder named</w:t>
-      </w:r>
-      <w:r>
-        <w:t xml:space="preserve"> </w:t>
-      </w:r>
-      <w:r>
-        <w:rPr>
-          <w:rStyle w:val="VerbatimChar"/>
-        </w:rPr>
-        <w:t xml:space="preserve">$trash.bin</w:t>
-      </w:r>
-      <w:r>
-        <w:t xml:space="preserve"> </w:t>
-      </w:r>
-      <w:r>
-        <w:t xml:space="preserve">at the root of the drive. You can change the folder name.</w:t>
+        <w:t xml:space="preserve">copies the file,</w:t>
       </w:r>
     </w:p>
     <w:p>
@@ -6200,39 +5841,17 @@
         </w:numPr>
       </w:pPr>
       <w:r>
-        <w:t xml:space="preserve">File &gt;</w:t>
-      </w:r>
-      <w:r>
-        <w:t xml:space="preserve"> </w:t>
-      </w:r>
-      <w:r>
-        <w:rPr>
-          <w:b/>
-          <w:bCs/>
-        </w:rPr>
-        <w:t xml:space="preserve">View Trash</w:t>
-      </w:r>
-      <w:r>
-        <w:t xml:space="preserve"> </w:t>
-      </w:r>
-      <w:r>
-        <w:t xml:space="preserve">opens it; File &gt;</w:t>
-      </w:r>
-      <w:r>
-        <w:t xml:space="preserve"> </w:t>
-      </w:r>
-      <w:r>
-        <w:rPr>
-          <w:b/>
-          <w:bCs/>
-        </w:rPr>
-        <w:t xml:space="preserve">Empty Trash…</w:t>
-      </w:r>
-      <w:r>
-        <w:t xml:space="preserve"> </w:t>
-      </w:r>
-      <w:r>
-        <w:t xml:space="preserve">empties it after asking.</w:t>
+        <w:rPr>
+          <w:b/>
+          <w:bCs/>
+        </w:rPr>
+        <w:t xml:space="preserve">verifies</w:t>
+      </w:r>
+      <w:r>
+        <w:t xml:space="preserve"> </w:t>
+      </w:r>
+      <w:r>
+        <w:t xml:space="preserve">it by reading the copy back and comparing a checksum (one automatic retry if it differs),</w:t>
       </w:r>
     </w:p>
     <w:p>
@@ -6241,6 +5860,440 @@
         <w:numPr>
           <w:ilvl w:val="0"/>
           <w:numId w:val="1013"/>
+        </w:numPr>
+      </w:pPr>
+      <w:r>
+        <w:t xml:space="preserve">optionally makes a</w:t>
+      </w:r>
+      <w:r>
+        <w:t xml:space="preserve"> </w:t>
+      </w:r>
+      <w:r>
+        <w:rPr>
+          <w:b/>
+          <w:bCs/>
+        </w:rPr>
+        <w:t xml:space="preserve">backup copy</w:t>
+      </w:r>
+      <w:r>
+        <w:t xml:space="preserve">, and</w:t>
+      </w:r>
+    </w:p>
+    <w:p>
+      <w:pPr>
+        <w:pStyle w:val="Compact"/>
+        <w:numPr>
+          <w:ilvl w:val="0"/>
+          <w:numId w:val="1013"/>
+        </w:numPr>
+      </w:pPr>
+      <w:r>
+        <w:t xml:space="preserve">applies the options you chose: capture time as the file date, read-only, lower-case names, lossless auto-rotation, author/copyright, IPTC/XMP data, EXIF text file.</w:t>
+      </w:r>
+    </w:p>
+    <w:p>
+      <w:pPr>
+        <w:pStyle w:val="FirstParagraph"/>
+      </w:pPr>
+      <w:r>
+        <w:t xml:space="preserve">A progress window shows the file being copied and has a</w:t>
+      </w:r>
+      <w:r>
+        <w:t xml:space="preserve"> </w:t>
+      </w:r>
+      <w:r>
+        <w:rPr>
+          <w:b/>
+          <w:bCs/>
+        </w:rPr>
+        <w:t xml:space="preserve">Cancel</w:t>
+      </w:r>
+      <w:r>
+        <w:t xml:space="preserve"> </w:t>
+      </w:r>
+      <w:r>
+        <w:t xml:space="preserve">button; a cancelled download can simply be started again, and files already copied are recognized as downloaded.</w:t>
+      </w:r>
+    </w:p>
+    <w:p>
+      <w:pPr>
+        <w:pStyle w:val="BodyText"/>
+      </w:pPr>
+      <w:r>
+        <w:rPr>
+          <w:b/>
+          <w:bCs/>
+        </w:rPr>
+        <w:t xml:space="preserve">Verify every copy</w:t>
+      </w:r>
+      <w:r>
+        <w:t xml:space="preserve"> </w:t>
+      </w:r>
+      <w:r>
+        <w:t xml:space="preserve">is on by default (Preferences &gt; Download Path).</w:t>
+      </w:r>
+      <w:r>
+        <w:t xml:space="preserve"> </w:t>
+      </w:r>
+      <w:r>
+        <w:rPr>
+          <w:b/>
+          <w:bCs/>
+        </w:rPr>
+        <w:t xml:space="preserve">Also save a second copy to a backup folder</w:t>
+      </w:r>
+      <w:r>
+        <w:t xml:space="preserve"> </w:t>
+      </w:r>
+      <w:r>
+        <w:t xml:space="preserve">makes another copy, using the same patterns, from the verified download before any rotation or metadata is applied. A file whose backup failed is never offered for deletion.</w:t>
+      </w:r>
+    </w:p>
+    <w:p>
+      <w:pPr>
+        <w:pStyle w:val="BodyText"/>
+      </w:pPr>
+      <w:r>
+        <w:rPr>
+          <w:b/>
+          <w:bCs/>
+        </w:rPr>
+        <w:t xml:space="preserve">Auto-rotate.</w:t>
+      </w:r>
+      <w:r>
+        <w:t xml:space="preserve"> </w:t>
+      </w:r>
+      <w:r>
+        <w:t xml:space="preserve">Downloaded JPEGs are turned upright according to their EXIF orientation without recompressing them (lossless). Up to 15 rows or columns that do not fill a block may be trimmed at one edge, as the standard tool</w:t>
+      </w:r>
+      <w:r>
+        <w:t xml:space="preserve"> </w:t>
+      </w:r>
+      <w:r>
+        <w:rPr>
+          <w:rStyle w:val="VerbatimChar"/>
+        </w:rPr>
+        <w:t xml:space="preserve">jpegtran -trim</w:t>
+      </w:r>
+      <w:r>
+        <w:t xml:space="preserve"> </w:t>
+      </w:r>
+      <w:r>
+        <w:t xml:space="preserve">does. The thumbnails and viewer always show pictures upright regardless of this option.</w:t>
+      </w:r>
+    </w:p>
+    <w:p>
+      <w:pPr>
+        <w:pStyle w:val="BodyText"/>
+      </w:pPr>
+      <w:r>
+        <w:rPr>
+          <w:b/>
+          <w:bCs/>
+        </w:rPr>
+        <w:t xml:space="preserve">Other options</w:t>
+      </w:r>
+      <w:r>
+        <w:t xml:space="preserve"> </w:t>
+      </w:r>
+      <w:r>
+        <w:t xml:space="preserve">(Preferences &gt; File Handling): Save files as read-only; Preserve read-only status; Use image capture time for file timestamp; Convert file name to lower case; Lower case file extensions; Rename</w:t>
+      </w:r>
+      <w:r>
+        <w:t xml:space="preserve"> </w:t>
+      </w:r>
+      <w:r>
+        <w:rPr>
+          <w:rStyle w:val="VerbatimChar"/>
+        </w:rPr>
+        <w:t xml:space="preserve">.jpe</w:t>
+      </w:r>
+      <w:r>
+        <w:t xml:space="preserve"> </w:t>
+      </w:r>
+      <w:r>
+        <w:t xml:space="preserve">to</w:t>
+      </w:r>
+      <w:r>
+        <w:t xml:space="preserve"> </w:t>
+      </w:r>
+      <w:r>
+        <w:rPr>
+          <w:rStyle w:val="VerbatimChar"/>
+        </w:rPr>
+        <w:t xml:space="preserve">.jpg</w:t>
+      </w:r>
+      <w:r>
+        <w:t xml:space="preserve">; Save Lightroom previews (</w:t>
+      </w:r>
+      <w:r>
+        <w:rPr>
+          <w:rStyle w:val="VerbatimChar"/>
+        </w:rPr>
+        <w:t xml:space="preserve">.lrprev</w:t>
+      </w:r>
+      <w:r>
+        <w:t xml:space="preserve">) as</w:t>
+      </w:r>
+      <w:r>
+        <w:t xml:space="preserve"> </w:t>
+      </w:r>
+      <w:r>
+        <w:rPr>
+          <w:rStyle w:val="VerbatimChar"/>
+        </w:rPr>
+        <w:t xml:space="preserve">.jpg</w:t>
+      </w:r>
+      <w:r>
+        <w:t xml:space="preserve">, optionally keeping both; Generate text file containing EXIF shooting data; Add IPTC/XMP data (a</w:t>
+      </w:r>
+      <w:r>
+        <w:t xml:space="preserve"> </w:t>
+      </w:r>
+      <w:r>
+        <w:rPr>
+          <w:rStyle w:val="VerbatimChar"/>
+        </w:rPr>
+        <w:t xml:space="preserve">.xmp</w:t>
+      </w:r>
+      <w:r>
+        <w:t xml:space="preserve"> </w:t>
+      </w:r>
+      <w:r>
+        <w:t xml:space="preserve">sidecar is written; see Edit &gt; IPTC/XMP Data); Add author and copyright to EXIF of downloaded JPEGs (only where those fields are empty).</w:t>
+      </w:r>
+    </w:p>
+    <w:p>
+      <w:pPr>
+        <w:pStyle w:val="BodyText"/>
+      </w:pPr>
+      <w:r>
+        <w:rPr>
+          <w:b/>
+          <w:bCs/>
+        </w:rPr>
+        <w:t xml:space="preserve">Custom button.</w:t>
+      </w:r>
+      <w:r>
+        <w:t xml:space="preserve"> </w:t>
+      </w:r>
+      <w:r>
+        <w:t xml:space="preserve">Preferences &gt; Custom button adds a button with your own caption that runs a program. In the command line</w:t>
+      </w:r>
+      <w:r>
+        <w:t xml:space="preserve"> </w:t>
+      </w:r>
+      <w:r>
+        <w:rPr>
+          <w:rStyle w:val="VerbatimChar"/>
+        </w:rPr>
+        <w:t xml:space="preserve">%f</w:t>
+      </w:r>
+      <w:r>
+        <w:t xml:space="preserve"> </w:t>
+      </w:r>
+      <w:r>
+        <w:t xml:space="preserve">is the file and</w:t>
+      </w:r>
+      <w:r>
+        <w:t xml:space="preserve"> </w:t>
+      </w:r>
+      <w:r>
+        <w:rPr>
+          <w:rStyle w:val="VerbatimChar"/>
+        </w:rPr>
+        <w:t xml:space="preserve">%d</w:t>
+      </w:r>
+      <w:r>
+        <w:t xml:space="preserve"> </w:t>
+      </w:r>
+      <w:r>
+        <w:t xml:space="preserve">its directory.</w:t>
+      </w:r>
+    </w:p>
+    <w:p>
+      <w:pPr>
+        <w:pStyle w:val="Heading2"/>
+      </w:pPr>
+      <w:bookmarkStart w:id="23" w:name="_fcb1a6fe1f2ffd99d6b38a945e0ca912e43900a"/>
+      <w:r>
+        <w:t xml:space="preserve">10. Deleting from the card</w:t>
+      </w:r>
+      <w:bookmarkEnd w:id="23"/>
+    </w:p>
+    <w:p>
+      <w:pPr>
+        <w:pStyle w:val="FirstParagraph"/>
+      </w:pPr>
+      <w:r>
+        <w:rPr>
+          <w:b/>
+          <w:bCs/>
+        </w:rPr>
+        <w:t xml:space="preserve">Delete</w:t>
+      </w:r>
+      <w:r>
+        <w:t xml:space="preserve"> </w:t>
+      </w:r>
+      <w:r>
+        <w:t xml:space="preserve">(the button, or right-click &gt; Delete selected file(s) from source) removes selected pictures from the</w:t>
+      </w:r>
+      <w:r>
+        <w:t xml:space="preserve"> </w:t>
+      </w:r>
+      <w:r>
+        <w:rPr>
+          <w:i/>
+          <w:iCs/>
+        </w:rPr>
+        <w:t xml:space="preserve">source</w:t>
+      </w:r>
+      <w:r>
+        <w:t xml:space="preserve"> </w:t>
+      </w:r>
+      <w:r>
+        <w:t xml:space="preserve">– but only those that are marked</w:t>
+      </w:r>
+      <w:r>
+        <w:t xml:space="preserve"> </w:t>
+      </w:r>
+      <w:r>
+        <w:rPr>
+          <w:b/>
+          <w:bCs/>
+        </w:rPr>
+        <w:t xml:space="preserve">Already downloaded</w:t>
+      </w:r>
+      <w:r>
+        <w:t xml:space="preserve"> </w:t>
+      </w:r>
+      <w:r>
+        <w:t xml:space="preserve">and really exist in the destination (and, if a backup is on, in the backup). Anything else is left alone.</w:t>
+      </w:r>
+    </w:p>
+    <w:p>
+      <w:pPr>
+        <w:pStyle w:val="BodyText"/>
+      </w:pPr>
+      <w:r>
+        <w:rPr>
+          <w:b/>
+          <w:bCs/>
+        </w:rPr>
+        <w:t xml:space="preserve">Safe delete</w:t>
+      </w:r>
+      <w:r>
+        <w:t xml:space="preserve"> </w:t>
+      </w:r>
+      <w:r>
+        <w:t xml:space="preserve">is on by default (Preferences &gt; Automation):</w:t>
+      </w:r>
+    </w:p>
+    <w:p>
+      <w:pPr>
+        <w:pStyle w:val="Compact"/>
+        <w:numPr>
+          <w:ilvl w:val="0"/>
+          <w:numId w:val="1014"/>
+        </w:numPr>
+      </w:pPr>
+      <w:r>
+        <w:t xml:space="preserve">On your computer’s own disks, deleted files go to the</w:t>
+      </w:r>
+      <w:r>
+        <w:t xml:space="preserve"> </w:t>
+      </w:r>
+      <w:r>
+        <w:rPr>
+          <w:b/>
+          <w:bCs/>
+        </w:rPr>
+        <w:t xml:space="preserve">Recycle Bin</w:t>
+      </w:r>
+      <w:r>
+        <w:t xml:space="preserve"> </w:t>
+      </w:r>
+      <w:r>
+        <w:t xml:space="preserve">(Linux: the trash).</w:t>
+      </w:r>
+    </w:p>
+    <w:p>
+      <w:pPr>
+        <w:pStyle w:val="Compact"/>
+        <w:numPr>
+          <w:ilvl w:val="0"/>
+          <w:numId w:val="1014"/>
+        </w:numPr>
+      </w:pPr>
+      <w:r>
+        <w:t xml:space="preserve">On cards, USB drives and network drives, they are moved to a hidden folder named</w:t>
+      </w:r>
+      <w:r>
+        <w:t xml:space="preserve"> </w:t>
+      </w:r>
+      <w:r>
+        <w:rPr>
+          <w:rStyle w:val="VerbatimChar"/>
+        </w:rPr>
+        <w:t xml:space="preserve">$trash.bin</w:t>
+      </w:r>
+      <w:r>
+        <w:t xml:space="preserve"> </w:t>
+      </w:r>
+      <w:r>
+        <w:t xml:space="preserve">at the root of the drive. You can change the folder name.</w:t>
+      </w:r>
+    </w:p>
+    <w:p>
+      <w:pPr>
+        <w:pStyle w:val="Compact"/>
+        <w:numPr>
+          <w:ilvl w:val="0"/>
+          <w:numId w:val="1014"/>
+        </w:numPr>
+      </w:pPr>
+      <w:r>
+        <w:t xml:space="preserve">File &gt;</w:t>
+      </w:r>
+      <w:r>
+        <w:t xml:space="preserve"> </w:t>
+      </w:r>
+      <w:r>
+        <w:rPr>
+          <w:b/>
+          <w:bCs/>
+        </w:rPr>
+        <w:t xml:space="preserve">View Trash</w:t>
+      </w:r>
+      <w:r>
+        <w:t xml:space="preserve"> </w:t>
+      </w:r>
+      <w:r>
+        <w:t xml:space="preserve">opens it; File &gt;</w:t>
+      </w:r>
+      <w:r>
+        <w:t xml:space="preserve"> </w:t>
+      </w:r>
+      <w:r>
+        <w:rPr>
+          <w:b/>
+          <w:bCs/>
+        </w:rPr>
+        <w:t xml:space="preserve">Empty Trash…</w:t>
+      </w:r>
+      <w:r>
+        <w:t xml:space="preserve"> </w:t>
+      </w:r>
+      <w:r>
+        <w:t xml:space="preserve">empties it after asking.</w:t>
+      </w:r>
+    </w:p>
+    <w:p>
+      <w:pPr>
+        <w:pStyle w:val="Compact"/>
+        <w:numPr>
+          <w:ilvl w:val="0"/>
+          <w:numId w:val="1014"/>
         </w:numPr>
       </w:pPr>
       <w:r>
@@ -6542,7 +6595,7 @@
         <w:pStyle w:val="Compact"/>
         <w:numPr>
           <w:ilvl w:val="0"/>
-          <w:numId w:val="1014"/>
+          <w:numId w:val="1015"/>
         </w:numPr>
       </w:pPr>
       <w:r>
@@ -6570,610 +6623,6 @@
       </w:r>
       <w:r>
         <w:t xml:space="preserve">. On Linux, removable drives are found automatically.</w:t>
-      </w:r>
-    </w:p>
-    <w:p>
-      <w:pPr>
-        <w:pStyle w:val="Compact"/>
-        <w:numPr>
-          <w:ilvl w:val="0"/>
-          <w:numId w:val="1014"/>
-        </w:numPr>
-      </w:pPr>
-      <w:r>
-        <w:rPr>
-          <w:b/>
-          <w:bCs/>
-        </w:rPr>
-        <w:t xml:space="preserve">Disable PTP downloads.</w:t>
-      </w:r>
-    </w:p>
-    <w:p>
-      <w:pPr>
-        <w:pStyle w:val="Compact"/>
-        <w:numPr>
-          <w:ilvl w:val="0"/>
-          <w:numId w:val="1014"/>
-        </w:numPr>
-      </w:pPr>
-      <w:r>
-        <w:t xml:space="preserve">Load the last used source folder at start-up.</w:t>
-      </w:r>
-    </w:p>
-    <w:p>
-      <w:pPr>
-        <w:pStyle w:val="Compact"/>
-        <w:numPr>
-          <w:ilvl w:val="0"/>
-          <w:numId w:val="1014"/>
-        </w:numPr>
-      </w:pPr>
-      <w:r>
-        <w:t xml:space="preserve">Prompt for user profile at start-up.</w:t>
-      </w:r>
-    </w:p>
-    <w:p>
-      <w:pPr>
-        <w:pStyle w:val="Compact"/>
-        <w:numPr>
-          <w:ilvl w:val="0"/>
-          <w:numId w:val="1014"/>
-        </w:numPr>
-      </w:pPr>
-      <w:r>
-        <w:t xml:space="preserve">Save date-based job codes.</w:t>
-      </w:r>
-    </w:p>
-    <w:p>
-      <w:pPr>
-        <w:pStyle w:val="Compact"/>
-        <w:numPr>
-          <w:ilvl w:val="0"/>
-          <w:numId w:val="1014"/>
-        </w:numPr>
-      </w:pPr>
-      <w:r>
-        <w:t xml:space="preserve">Automatically eject card reader media when disconnecting.</w:t>
-      </w:r>
-    </w:p>
-    <w:p>
-      <w:pPr>
-        <w:pStyle w:val="Compact"/>
-        <w:numPr>
-          <w:ilvl w:val="0"/>
-          <w:numId w:val="1014"/>
-        </w:numPr>
-      </w:pPr>
-      <w:r>
-        <w:t xml:space="preserve">Scan whole disk.</w:t>
-      </w:r>
-    </w:p>
-    <w:p>
-      <w:pPr>
-        <w:pStyle w:val="Compact"/>
-        <w:numPr>
-          <w:ilvl w:val="0"/>
-          <w:numId w:val="1014"/>
-        </w:numPr>
-      </w:pPr>
-      <w:r>
-        <w:rPr>
-          <w:b/>
-          <w:bCs/>
-        </w:rPr>
-        <w:t xml:space="preserve">Scan Lightroom preview folders (.lrdata) for .lrprev files</w:t>
-      </w:r>
-      <w:r>
-        <w:t xml:space="preserve"> </w:t>
-      </w:r>
-      <w:r>
-        <w:t xml:space="preserve">(off by default). Lightroom keeps its previews in tens of thousands of small folders; with this option off they are skipped, which makes scanning a picture folder that holds a Lightroom catalog much faster. Changing it scans the source again.</w:t>
-      </w:r>
-    </w:p>
-    <w:p>
-      <w:pPr>
-        <w:pStyle w:val="Compact"/>
-        <w:numPr>
-          <w:ilvl w:val="0"/>
-          <w:numId w:val="1014"/>
-        </w:numPr>
-      </w:pPr>
-      <w:r>
-        <w:t xml:space="preserve">IPTC/XMP options, including legacy IPTC IIM data and Nikon NEF raw files.</w:t>
-      </w:r>
-    </w:p>
-    <w:p>
-      <w:pPr>
-        <w:pStyle w:val="Compact"/>
-        <w:numPr>
-          <w:ilvl w:val="0"/>
-          <w:numId w:val="1014"/>
-        </w:numPr>
-      </w:pPr>
-      <w:r>
-        <w:t xml:space="preserve">Author and copyright for downloaded JPEGs.</w:t>
-      </w:r>
-    </w:p>
-    <w:p>
-      <w:pPr>
-        <w:pStyle w:val="Compact"/>
-        <w:numPr>
-          <w:ilvl w:val="0"/>
-          <w:numId w:val="1014"/>
-        </w:numPr>
-      </w:pPr>
-      <w:r>
-        <w:t xml:space="preserve">Run only one copy at a time (Windows; applies at the next start).</w:t>
-      </w:r>
-    </w:p>
-    <w:p>
-      <w:pPr>
-        <w:pStyle w:val="Heading3"/>
-      </w:pPr>
-      <w:bookmarkStart w:id="28" w:name="_1bbb229fa30fe0c1e3cdc2173fa8737b0ad4291"/>
-      <w:r>
-        <w:t xml:space="preserve">File Handling</w:t>
-      </w:r>
-      <w:bookmarkEnd w:id="28"/>
-    </w:p>
-    <w:p>
-      <w:pPr>
-        <w:pStyle w:val="FirstParagraph"/>
-      </w:pPr>
-      <w:r>
-        <w:t xml:space="preserve">How downloaded files are named, copied and treated.</w:t>
-      </w:r>
-      <w:r>
-        <w:t xml:space="preserve"> </w:t>
-      </w:r>
-      <w:r>
-        <w:t xml:space="preserve">- Save files as read-only; preserve read-only status.</w:t>
-      </w:r>
-      <w:r>
-        <w:t xml:space="preserve"> </w:t>
-      </w:r>
-      <w:r>
-        <w:t xml:space="preserve">-</w:t>
-      </w:r>
-      <w:r>
-        <w:t xml:space="preserve"> </w:t>
-      </w:r>
-      <w:r>
-        <w:rPr>
-          <w:b/>
-          <w:bCs/>
-        </w:rPr>
-        <w:t xml:space="preserve">Rename name clashes as (1), (2) …</w:t>
-      </w:r>
-      <w:r>
-        <w:t xml:space="preserve">;</w:t>
-      </w:r>
-      <w:r>
-        <w:t xml:space="preserve"> </w:t>
-      </w:r>
-      <w:r>
-        <w:rPr>
-          <w:b/>
-          <w:bCs/>
-        </w:rPr>
-        <w:t xml:space="preserve">Ignore duplicate files on download</w:t>
-      </w:r>
-      <w:r>
-        <w:t xml:space="preserve">;</w:t>
-      </w:r>
-      <w:r>
-        <w:t xml:space="preserve"> </w:t>
-      </w:r>
-      <w:r>
-        <w:rPr>
-          <w:b/>
-          <w:bCs/>
-        </w:rPr>
-        <w:t xml:space="preserve">Download duplicates as (1), (2) …</w:t>
-      </w:r>
-      <w:r>
-        <w:t xml:space="preserve"> </w:t>
-      </w:r>
-      <w:r>
-        <w:t xml:space="preserve">(the last two exclude each other).</w:t>
-      </w:r>
-      <w:r>
-        <w:t xml:space="preserve"> </w:t>
-      </w:r>
-      <w:r>
-        <w:t xml:space="preserve">- Ignore file size check (for images modified after downloading).</w:t>
-      </w:r>
-      <w:r>
-        <w:t xml:space="preserve"> </w:t>
-      </w:r>
-      <w:r>
-        <w:t xml:space="preserve">- Auto-rotate JPEGs after downloading (lossless).</w:t>
-      </w:r>
-      <w:r>
-        <w:t xml:space="preserve"> </w:t>
-      </w:r>
-      <w:r>
-        <w:t xml:space="preserve">- Rename</w:t>
-      </w:r>
-      <w:r>
-        <w:t xml:space="preserve"> </w:t>
-      </w:r>
-      <w:r>
-        <w:rPr>
-          <w:rStyle w:val="VerbatimChar"/>
-        </w:rPr>
-        <w:t xml:space="preserve">.jpe</w:t>
-      </w:r>
-      <w:r>
-        <w:t xml:space="preserve"> </w:t>
-      </w:r>
-      <w:r>
-        <w:t xml:space="preserve">files to</w:t>
-      </w:r>
-      <w:r>
-        <w:t xml:space="preserve"> </w:t>
-      </w:r>
-      <w:r>
-        <w:rPr>
-          <w:rStyle w:val="VerbatimChar"/>
-        </w:rPr>
-        <w:t xml:space="preserve">.jpg</w:t>
-      </w:r>
-      <w:r>
-        <w:t xml:space="preserve">.</w:t>
-      </w:r>
-      <w:r>
-        <w:t xml:space="preserve"> </w:t>
-      </w:r>
-      <w:r>
-        <w:t xml:space="preserve">-</w:t>
-      </w:r>
-      <w:r>
-        <w:t xml:space="preserve"> </w:t>
-      </w:r>
-      <w:r>
-        <w:rPr>
-          <w:b/>
-          <w:bCs/>
-        </w:rPr>
-        <w:t xml:space="preserve">Save Lightroom previews (.lrprev) as .jpg when downloading</w:t>
-      </w:r>
-      <w:r>
-        <w:t xml:space="preserve">: the largest preview picture in the file is saved as a</w:t>
-      </w:r>
-      <w:r>
-        <w:t xml:space="preserve"> </w:t>
-      </w:r>
-      <w:r>
-        <w:rPr>
-          <w:rStyle w:val="VerbatimChar"/>
-        </w:rPr>
-        <w:t xml:space="preserve">.jpg</w:t>
-      </w:r>
-      <w:r>
-        <w:t xml:space="preserve"> </w:t>
-      </w:r>
-      <w:r>
-        <w:t xml:space="preserve">(unchanged, not re-encoded) instead of the</w:t>
-      </w:r>
-      <w:r>
-        <w:t xml:space="preserve"> </w:t>
-      </w:r>
-      <w:r>
-        <w:rPr>
-          <w:rStyle w:val="VerbatimChar"/>
-        </w:rPr>
-        <w:t xml:space="preserve">.lrprev</w:t>
-      </w:r>
-      <w:r>
-        <w:t xml:space="preserve"> </w:t>
-      </w:r>
-      <w:r>
-        <w:t xml:space="preserve">file.</w:t>
-      </w:r>
-      <w:r>
-        <w:t xml:space="preserve"> </w:t>
-      </w:r>
-      <w:r>
-        <w:rPr>
-          <w:b/>
-          <w:bCs/>
-        </w:rPr>
-        <w:t xml:space="preserve">Save both</w:t>
-      </w:r>
-      <w:r>
-        <w:t xml:space="preserve"> </w:t>
-      </w:r>
-      <w:r>
-        <w:t xml:space="preserve">(only with the option above) keeps the</w:t>
-      </w:r>
-      <w:r>
-        <w:t xml:space="preserve"> </w:t>
-      </w:r>
-      <w:r>
-        <w:rPr>
-          <w:rStyle w:val="VerbatimChar"/>
-        </w:rPr>
-        <w:t xml:space="preserve">.lrprev</w:t>
-      </w:r>
-      <w:r>
-        <w:t xml:space="preserve"> </w:t>
-      </w:r>
-      <w:r>
-        <w:t xml:space="preserve">file and writes the</w:t>
-      </w:r>
-      <w:r>
-        <w:t xml:space="preserve"> </w:t>
-      </w:r>
-      <w:r>
-        <w:rPr>
-          <w:rStyle w:val="VerbatimChar"/>
-        </w:rPr>
-        <w:t xml:space="preserve">.jpg</w:t>
-      </w:r>
-      <w:r>
-        <w:t xml:space="preserve"> </w:t>
-      </w:r>
-      <w:r>
-        <w:t xml:space="preserve">next to it. A</w:t>
-      </w:r>
-      <w:r>
-        <w:t xml:space="preserve"> </w:t>
-      </w:r>
-      <w:r>
-        <w:rPr>
-          <w:rStyle w:val="VerbatimChar"/>
-        </w:rPr>
-        <w:t xml:space="preserve">.lrprev</w:t>
-      </w:r>
-      <w:r>
-        <w:t xml:space="preserve"> </w:t>
-      </w:r>
-      <w:r>
-        <w:t xml:space="preserve">saved as</w:t>
-      </w:r>
-      <w:r>
-        <w:t xml:space="preserve"> </w:t>
-      </w:r>
-      <w:r>
-        <w:rPr>
-          <w:rStyle w:val="VerbatimChar"/>
-        </w:rPr>
-        <w:t xml:space="preserve">.jpg</w:t>
-      </w:r>
-      <w:r>
-        <w:t xml:space="preserve"> </w:t>
-      </w:r>
-      <w:r>
-        <w:t xml:space="preserve">counts as downloaded when the</w:t>
-      </w:r>
-      <w:r>
-        <w:t xml:space="preserve"> </w:t>
-      </w:r>
-      <w:r>
-        <w:rPr>
-          <w:rStyle w:val="VerbatimChar"/>
-        </w:rPr>
-        <w:t xml:space="preserve">.jpg</w:t>
-      </w:r>
-      <w:r>
-        <w:t xml:space="preserve"> </w:t>
-      </w:r>
-      <w:r>
-        <w:t xml:space="preserve">exists (its size never matches the original).</w:t>
-      </w:r>
-      <w:r>
-        <w:t xml:space="preserve"> </w:t>
-      </w:r>
-      <w:r>
-        <w:t xml:space="preserve">- Convert file names to lower case; lower case file extensions.</w:t>
-      </w:r>
-      <w:r>
-        <w:t xml:space="preserve"> </w:t>
-      </w:r>
-      <w:r>
-        <w:t xml:space="preserve">- Use image capture time for the file timestamp.</w:t>
-      </w:r>
-      <w:r>
-        <w:t xml:space="preserve"> </w:t>
-      </w:r>
-      <w:r>
-        <w:t xml:space="preserve">- Generate a text file containing EXIF shooting data.</w:t>
-      </w:r>
-      <w:r>
-        <w:t xml:space="preserve"> </w:t>
-      </w:r>
-      <w:r>
-        <w:t xml:space="preserve">- Windows-safe file names (Linux only): replaces characters such as</w:t>
-      </w:r>
-      <w:r>
-        <w:t xml:space="preserve"> </w:t>
-      </w:r>
-      <w:r>
-        <w:rPr>
-          <w:rStyle w:val="VerbatimChar"/>
-        </w:rPr>
-        <w:t xml:space="preserve">: ? * " &lt; &gt; |</w:t>
-      </w:r>
-      <w:r>
-        <w:t xml:space="preserve">.</w:t>
-      </w:r>
-    </w:p>
-    <w:p>
-      <w:pPr>
-        <w:pStyle w:val="Heading3"/>
-      </w:pPr>
-      <w:bookmarkStart w:id="29" w:name="_automation"/>
-      <w:r>
-        <w:t xml:space="preserve">Automation</w:t>
-      </w:r>
-      <w:bookmarkEnd w:id="29"/>
-    </w:p>
-    <w:p>
-      <w:pPr>
-        <w:pStyle w:val="FirstParagraph"/>
-      </w:pPr>
-      <w:r>
-        <w:t xml:space="preserve">For hands-free use: start-up automation, an Automation menu item and shortcut (F4,</w:t>
-      </w:r>
-      <w:r>
-        <w:t xml:space="preserve"> </w:t>
-      </w:r>
-      <w:r>
-        <w:rPr>
-          <w:b/>
-          <w:bCs/>
-        </w:rPr>
-        <w:t xml:space="preserve">Start Auto Sequence</w:t>
-      </w:r>
-      <w:r>
-        <w:t xml:space="preserve">), an optional prompt before it starts, and what it does – download, delete from the card, eject, launch an application, exit. Safe delete and the trash folder name are set here too.</w:t>
-      </w:r>
-    </w:p>
-    <w:p>
-      <w:pPr>
-        <w:pStyle w:val="Heading3"/>
-      </w:pPr>
-      <w:bookmarkStart w:id="30" w:name="_mapping"/>
-      <w:r>
-        <w:t xml:space="preserve">Mapping</w:t>
-      </w:r>
-      <w:bookmarkEnd w:id="30"/>
-    </w:p>
-    <w:p>
-      <w:pPr>
-        <w:pStyle w:val="FirstParagraph"/>
-      </w:pPr>
-      <w:r>
-        <w:t xml:space="preserve">Gives each camera its own values for the</w:t>
-      </w:r>
-      <w:r>
-        <w:t xml:space="preserve"> </w:t>
-      </w:r>
-      <w:r>
-        <w:rPr>
-          <w:rStyle w:val="VerbatimChar"/>
-        </w:rPr>
-        <w:t xml:space="preserve">{T8}</w:t>
-      </w:r>
-      <w:r>
-        <w:t xml:space="preserve"> </w:t>
-      </w:r>
-      <w:r>
-        <w:t xml:space="preserve">and</w:t>
-      </w:r>
-      <w:r>
-        <w:t xml:space="preserve"> </w:t>
-      </w:r>
-      <w:r>
-        <w:rPr>
-          <w:rStyle w:val="VerbatimChar"/>
-        </w:rPr>
-        <w:t xml:space="preserve">{T9}</w:t>
-      </w:r>
-      <w:r>
-        <w:t xml:space="preserve"> </w:t>
-      </w:r>
-      <w:r>
-        <w:t xml:space="preserve">tokens, for example a short code per camera body. Add cameras with</w:t>
-      </w:r>
-      <w:r>
-        <w:t xml:space="preserve"> </w:t>
-      </w:r>
-      <w:r>
-        <w:rPr>
-          <w:b/>
-          <w:bCs/>
-        </w:rPr>
-        <w:t xml:space="preserve">Add camera…</w:t>
-      </w:r>
-      <w:r>
-        <w:t xml:space="preserve">; edit or delete entries with the buttons. Cameras can be identified by name or by serial number/owner string/user comment, and the program can ask when it meets a new camera.</w:t>
-      </w:r>
-    </w:p>
-    <w:p>
-      <w:pPr>
-        <w:pStyle w:val="Heading3"/>
-      </w:pPr>
-      <w:bookmarkStart w:id="31" w:name="_c02823a746ebaf499a7b8179d8ee10b9c460bba"/>
-      <w:r>
-        <w:t xml:space="preserve">Custom Button</w:t>
-      </w:r>
-      <w:bookmarkEnd w:id="31"/>
-    </w:p>
-    <w:p>
-      <w:pPr>
-        <w:pStyle w:val="FirstParagraph"/>
-      </w:pPr>
-      <w:r>
-        <w:t xml:space="preserve">Enable the button, set its caption and the command line.</w:t>
-      </w:r>
-    </w:p>
-    <w:p>
-      <w:pPr>
-        <w:pStyle w:val="Heading3"/>
-      </w:pPr>
-      <w:bookmarkStart w:id="32" w:name="_7fefb0e37b5304b8d54b3e10bc285efe9b76d35"/>
-      <w:r>
-        <w:t xml:space="preserve">Plug-ins</w:t>
-      </w:r>
-      <w:bookmarkEnd w:id="32"/>
-    </w:p>
-    <w:p>
-      <w:pPr>
-        <w:pStyle w:val="FirstParagraph"/>
-      </w:pPr>
-      <w:r>
-        <w:t xml:space="preserve">Lists the built-in plug-ins and any plug-in libraries found.</w:t>
-      </w:r>
-      <w:r>
-        <w:t xml:space="preserve"> </w:t>
-      </w:r>
-      <w:r>
-        <w:rPr>
-          <w:b/>
-          <w:bCs/>
-        </w:rPr>
-        <w:t xml:space="preserve">Directory Maker</w:t>
-      </w:r>
-      <w:r>
-        <w:t xml:space="preserve"> </w:t>
-      </w:r>
-      <w:r>
-        <w:t xml:space="preserve">works. The other built-in ones (JPEG auto profile, DNG Converter, JPEG resolution) are listed only and do nothing yet. The old Backup plug-in has been removed; backups are set with the backup folder on the Download Path tab.</w:t>
-      </w:r>
-    </w:p>
-    <w:p>
-      <w:pPr>
-        <w:pStyle w:val="BodyText"/>
-      </w:pPr>
-      <w:r>
-        <w:rPr>
-          <w:b/>
-          <w:bCs/>
-        </w:rPr>
-        <w:t xml:space="preserve">Plug-in libraries.</w:t>
-      </w:r>
-      <w:r>
-        <w:t xml:space="preserve"> </w:t>
-      </w:r>
-      <w:r>
-        <w:t xml:space="preserve">A plug-in library is a separate file that adds its own tokens to the folder and file name templates, for example to build folder names by an organization’s naming standard. Put the file into the</w:t>
-      </w:r>
-      <w:r>
-        <w:t xml:space="preserve"> </w:t>
-      </w:r>
-      <w:r>
-        <w:rPr>
-          <w:rStyle w:val="VerbatimChar"/>
-        </w:rPr>
-        <w:t xml:space="preserve">plugins</w:t>
-      </w:r>
-      <w:r>
-        <w:t xml:space="preserve"> </w:t>
-      </w:r>
-      <w:r>
-        <w:t xml:space="preserve">folder:</w:t>
       </w:r>
     </w:p>
     <w:p>
@@ -7185,49 +6634,11 @@
         </w:numPr>
       </w:pPr>
       <w:r>
-        <w:t xml:space="preserve">Windows:</w:t>
-      </w:r>
-      <w:r>
-        <w:t xml:space="preserve"> </w:t>
-      </w:r>
-      <w:r>
-        <w:rPr>
-          <w:rStyle w:val="VerbatimChar"/>
-        </w:rPr>
-        <w:t xml:space="preserve">%LOCALAPPDATA%\Photo Downloader\plugins\name.dll</w:t>
-      </w:r>
-      <w:r>
-        <w:t xml:space="preserve"> </w:t>
-      </w:r>
-      <w:r>
-        <w:t xml:space="preserve">(or a</w:t>
-      </w:r>
-      <w:r>
-        <w:t xml:space="preserve"> </w:t>
-      </w:r>
-      <w:r>
-        <w:rPr>
-          <w:rStyle w:val="VerbatimChar"/>
-        </w:rPr>
-        <w:t xml:space="preserve">plugins</w:t>
-      </w:r>
-      <w:r>
-        <w:t xml:space="preserve"> </w:t>
-      </w:r>
-      <w:r>
-        <w:t xml:space="preserve">folder next to</w:t>
-      </w:r>
-      <w:r>
-        <w:t xml:space="preserve"> </w:t>
-      </w:r>
-      <w:r>
-        <w:rPr>
-          <w:rStyle w:val="VerbatimChar"/>
-        </w:rPr>
-        <w:t xml:space="preserve">PhotoDownloader.exe</w:t>
-      </w:r>
-      <w:r>
-        <w:t xml:space="preserve">)</w:t>
+        <w:rPr>
+          <w:b/>
+          <w:bCs/>
+        </w:rPr>
+        <w:t xml:space="preserve">Disable PTP downloads.</w:t>
       </w:r>
     </w:p>
     <w:p>
@@ -7239,7 +6650,203 @@
         </w:numPr>
       </w:pPr>
       <w:r>
-        <w:t xml:space="preserve">Linux:</w:t>
+        <w:t xml:space="preserve">Load the last used source folder at start-up.</w:t>
+      </w:r>
+    </w:p>
+    <w:p>
+      <w:pPr>
+        <w:pStyle w:val="Compact"/>
+        <w:numPr>
+          <w:ilvl w:val="0"/>
+          <w:numId w:val="1015"/>
+        </w:numPr>
+      </w:pPr>
+      <w:r>
+        <w:t xml:space="preserve">Prompt for user profile at start-up.</w:t>
+      </w:r>
+    </w:p>
+    <w:p>
+      <w:pPr>
+        <w:pStyle w:val="Compact"/>
+        <w:numPr>
+          <w:ilvl w:val="0"/>
+          <w:numId w:val="1015"/>
+        </w:numPr>
+      </w:pPr>
+      <w:r>
+        <w:t xml:space="preserve">Save date-based job codes.</w:t>
+      </w:r>
+    </w:p>
+    <w:p>
+      <w:pPr>
+        <w:pStyle w:val="Compact"/>
+        <w:numPr>
+          <w:ilvl w:val="0"/>
+          <w:numId w:val="1015"/>
+        </w:numPr>
+      </w:pPr>
+      <w:r>
+        <w:t xml:space="preserve">Automatically eject card reader media when disconnecting.</w:t>
+      </w:r>
+    </w:p>
+    <w:p>
+      <w:pPr>
+        <w:pStyle w:val="Compact"/>
+        <w:numPr>
+          <w:ilvl w:val="0"/>
+          <w:numId w:val="1015"/>
+        </w:numPr>
+      </w:pPr>
+      <w:r>
+        <w:t xml:space="preserve">Scan whole disk.</w:t>
+      </w:r>
+    </w:p>
+    <w:p>
+      <w:pPr>
+        <w:pStyle w:val="Compact"/>
+        <w:numPr>
+          <w:ilvl w:val="0"/>
+          <w:numId w:val="1015"/>
+        </w:numPr>
+      </w:pPr>
+      <w:r>
+        <w:rPr>
+          <w:b/>
+          <w:bCs/>
+        </w:rPr>
+        <w:t xml:space="preserve">Scan Lightroom preview folders (.lrdata) for .lrprev files</w:t>
+      </w:r>
+      <w:r>
+        <w:t xml:space="preserve"> </w:t>
+      </w:r>
+      <w:r>
+        <w:t xml:space="preserve">(off by default). Lightroom keeps its previews in tens of thousands of small folders; with this option off they are skipped, which makes scanning a picture folder that holds a Lightroom catalog much faster. Changing it scans the source again.</w:t>
+      </w:r>
+    </w:p>
+    <w:p>
+      <w:pPr>
+        <w:pStyle w:val="Compact"/>
+        <w:numPr>
+          <w:ilvl w:val="0"/>
+          <w:numId w:val="1015"/>
+        </w:numPr>
+      </w:pPr>
+      <w:r>
+        <w:t xml:space="preserve">IPTC/XMP options, including legacy IPTC IIM data and Nikon NEF raw files.</w:t>
+      </w:r>
+    </w:p>
+    <w:p>
+      <w:pPr>
+        <w:pStyle w:val="Compact"/>
+        <w:numPr>
+          <w:ilvl w:val="0"/>
+          <w:numId w:val="1015"/>
+        </w:numPr>
+      </w:pPr>
+      <w:r>
+        <w:t xml:space="preserve">Author and copyright for downloaded JPEGs.</w:t>
+      </w:r>
+    </w:p>
+    <w:p>
+      <w:pPr>
+        <w:pStyle w:val="Compact"/>
+        <w:numPr>
+          <w:ilvl w:val="0"/>
+          <w:numId w:val="1015"/>
+        </w:numPr>
+      </w:pPr>
+      <w:r>
+        <w:t xml:space="preserve">Run only one copy at a time (Windows; applies at the next start).</w:t>
+      </w:r>
+    </w:p>
+    <w:p>
+      <w:pPr>
+        <w:pStyle w:val="Heading3"/>
+      </w:pPr>
+      <w:bookmarkStart w:id="28" w:name="_1bbb229fa30fe0c1e3cdc2173fa8737b0ad4291"/>
+      <w:r>
+        <w:t xml:space="preserve">File Handling</w:t>
+      </w:r>
+      <w:bookmarkEnd w:id="28"/>
+    </w:p>
+    <w:p>
+      <w:pPr>
+        <w:pStyle w:val="FirstParagraph"/>
+      </w:pPr>
+      <w:r>
+        <w:t xml:space="preserve">How downloaded files are named, copied and treated.</w:t>
+      </w:r>
+      <w:r>
+        <w:t xml:space="preserve"> </w:t>
+      </w:r>
+      <w:r>
+        <w:t xml:space="preserve">- Save files as read-only; preserve read-only status.</w:t>
+      </w:r>
+      <w:r>
+        <w:t xml:space="preserve"> </w:t>
+      </w:r>
+      <w:r>
+        <w:t xml:space="preserve">-</w:t>
+      </w:r>
+      <w:r>
+        <w:t xml:space="preserve"> </w:t>
+      </w:r>
+      <w:r>
+        <w:rPr>
+          <w:b/>
+          <w:bCs/>
+        </w:rPr>
+        <w:t xml:space="preserve">Rename name clashes as (1), (2) …</w:t>
+      </w:r>
+      <w:r>
+        <w:t xml:space="preserve">;</w:t>
+      </w:r>
+      <w:r>
+        <w:t xml:space="preserve"> </w:t>
+      </w:r>
+      <w:r>
+        <w:rPr>
+          <w:b/>
+          <w:bCs/>
+        </w:rPr>
+        <w:t xml:space="preserve">Ignore duplicate files on download</w:t>
+      </w:r>
+      <w:r>
+        <w:t xml:space="preserve">;</w:t>
+      </w:r>
+      <w:r>
+        <w:t xml:space="preserve"> </w:t>
+      </w:r>
+      <w:r>
+        <w:rPr>
+          <w:b/>
+          <w:bCs/>
+        </w:rPr>
+        <w:t xml:space="preserve">Download duplicates as (1), (2) …</w:t>
+      </w:r>
+      <w:r>
+        <w:t xml:space="preserve"> </w:t>
+      </w:r>
+      <w:r>
+        <w:t xml:space="preserve">(the last two exclude each other).</w:t>
+      </w:r>
+      <w:r>
+        <w:t xml:space="preserve"> </w:t>
+      </w:r>
+      <w:r>
+        <w:t xml:space="preserve">- Ignore file size check (for images modified after downloading).</w:t>
+      </w:r>
+      <w:r>
+        <w:t xml:space="preserve"> </w:t>
+      </w:r>
+      <w:r>
+        <w:t xml:space="preserve">- Auto-rotate JPEGs after downloading (lossless).</w:t>
+      </w:r>
+      <w:r>
+        <w:t xml:space="preserve"> </w:t>
+      </w:r>
+      <w:r>
+        <w:t xml:space="preserve">- Rename</w:t>
       </w:r>
       <w:r>
         <w:t xml:space="preserve"> </w:t>
@@ -7248,13 +6855,13 @@
         <w:rPr>
           <w:rStyle w:val="VerbatimChar"/>
         </w:rPr>
-        <w:t xml:space="preserve">~/.config/Photo Downloader/plugins/libname.so</w:t>
-      </w:r>
-      <w:r>
-        <w:t xml:space="preserve"> </w:t>
-      </w:r>
-      <w:r>
-        <w:t xml:space="preserve">(or a</w:t>
+        <w:t xml:space="preserve">.jpe</w:t>
+      </w:r>
+      <w:r>
+        <w:t xml:space="preserve"> </w:t>
+      </w:r>
+      <w:r>
+        <w:t xml:space="preserve">files to</w:t>
       </w:r>
       <w:r>
         <w:t xml:space="preserve"> </w:t>
@@ -7263,287 +6870,363 @@
         <w:rPr>
           <w:rStyle w:val="VerbatimChar"/>
         </w:rPr>
+        <w:t xml:space="preserve">.jpg</w:t>
+      </w:r>
+      <w:r>
+        <w:t xml:space="preserve">.</w:t>
+      </w:r>
+      <w:r>
+        <w:t xml:space="preserve"> </w:t>
+      </w:r>
+      <w:r>
+        <w:t xml:space="preserve">-</w:t>
+      </w:r>
+      <w:r>
+        <w:t xml:space="preserve"> </w:t>
+      </w:r>
+      <w:r>
+        <w:rPr>
+          <w:b/>
+          <w:bCs/>
+        </w:rPr>
+        <w:t xml:space="preserve">Save Lightroom previews (.lrprev) as .jpg when downloading</w:t>
+      </w:r>
+      <w:r>
+        <w:t xml:space="preserve">: the largest preview picture in the file is saved as a</w:t>
+      </w:r>
+      <w:r>
+        <w:t xml:space="preserve"> </w:t>
+      </w:r>
+      <w:r>
+        <w:rPr>
+          <w:rStyle w:val="VerbatimChar"/>
+        </w:rPr>
+        <w:t xml:space="preserve">.jpg</w:t>
+      </w:r>
+      <w:r>
+        <w:t xml:space="preserve"> </w:t>
+      </w:r>
+      <w:r>
+        <w:t xml:space="preserve">(unchanged, not re-encoded) instead of the</w:t>
+      </w:r>
+      <w:r>
+        <w:t xml:space="preserve"> </w:t>
+      </w:r>
+      <w:r>
+        <w:rPr>
+          <w:rStyle w:val="VerbatimChar"/>
+        </w:rPr>
+        <w:t xml:space="preserve">.lrprev</w:t>
+      </w:r>
+      <w:r>
+        <w:t xml:space="preserve"> </w:t>
+      </w:r>
+      <w:r>
+        <w:t xml:space="preserve">file.</w:t>
+      </w:r>
+      <w:r>
+        <w:t xml:space="preserve"> </w:t>
+      </w:r>
+      <w:r>
+        <w:rPr>
+          <w:b/>
+          <w:bCs/>
+        </w:rPr>
+        <w:t xml:space="preserve">Save both</w:t>
+      </w:r>
+      <w:r>
+        <w:t xml:space="preserve"> </w:t>
+      </w:r>
+      <w:r>
+        <w:t xml:space="preserve">(only with the option above) keeps the</w:t>
+      </w:r>
+      <w:r>
+        <w:t xml:space="preserve"> </w:t>
+      </w:r>
+      <w:r>
+        <w:rPr>
+          <w:rStyle w:val="VerbatimChar"/>
+        </w:rPr>
+        <w:t xml:space="preserve">.lrprev</w:t>
+      </w:r>
+      <w:r>
+        <w:t xml:space="preserve"> </w:t>
+      </w:r>
+      <w:r>
+        <w:t xml:space="preserve">file and writes the</w:t>
+      </w:r>
+      <w:r>
+        <w:t xml:space="preserve"> </w:t>
+      </w:r>
+      <w:r>
+        <w:rPr>
+          <w:rStyle w:val="VerbatimChar"/>
+        </w:rPr>
+        <w:t xml:space="preserve">.jpg</w:t>
+      </w:r>
+      <w:r>
+        <w:t xml:space="preserve"> </w:t>
+      </w:r>
+      <w:r>
+        <w:t xml:space="preserve">next to it. A</w:t>
+      </w:r>
+      <w:r>
+        <w:t xml:space="preserve"> </w:t>
+      </w:r>
+      <w:r>
+        <w:rPr>
+          <w:rStyle w:val="VerbatimChar"/>
+        </w:rPr>
+        <w:t xml:space="preserve">.lrprev</w:t>
+      </w:r>
+      <w:r>
+        <w:t xml:space="preserve"> </w:t>
+      </w:r>
+      <w:r>
+        <w:t xml:space="preserve">saved as</w:t>
+      </w:r>
+      <w:r>
+        <w:t xml:space="preserve"> </w:t>
+      </w:r>
+      <w:r>
+        <w:rPr>
+          <w:rStyle w:val="VerbatimChar"/>
+        </w:rPr>
+        <w:t xml:space="preserve">.jpg</w:t>
+      </w:r>
+      <w:r>
+        <w:t xml:space="preserve"> </w:t>
+      </w:r>
+      <w:r>
+        <w:t xml:space="preserve">counts as downloaded when the</w:t>
+      </w:r>
+      <w:r>
+        <w:t xml:space="preserve"> </w:t>
+      </w:r>
+      <w:r>
+        <w:rPr>
+          <w:rStyle w:val="VerbatimChar"/>
+        </w:rPr>
+        <w:t xml:space="preserve">.jpg</w:t>
+      </w:r>
+      <w:r>
+        <w:t xml:space="preserve"> </w:t>
+      </w:r>
+      <w:r>
+        <w:t xml:space="preserve">exists (its size never matches the original).</w:t>
+      </w:r>
+      <w:r>
+        <w:t xml:space="preserve"> </w:t>
+      </w:r>
+      <w:r>
+        <w:t xml:space="preserve">- Convert file names to lower case; lower case file extensions.</w:t>
+      </w:r>
+      <w:r>
+        <w:t xml:space="preserve"> </w:t>
+      </w:r>
+      <w:r>
+        <w:t xml:space="preserve">- Use image capture time for the file timestamp.</w:t>
+      </w:r>
+      <w:r>
+        <w:t xml:space="preserve"> </w:t>
+      </w:r>
+      <w:r>
+        <w:t xml:space="preserve">- Generate a text file containing EXIF shooting data.</w:t>
+      </w:r>
+      <w:r>
+        <w:t xml:space="preserve"> </w:t>
+      </w:r>
+      <w:r>
+        <w:t xml:space="preserve">- Windows-safe file names (Linux only): replaces characters such as</w:t>
+      </w:r>
+      <w:r>
+        <w:t xml:space="preserve"> </w:t>
+      </w:r>
+      <w:r>
+        <w:rPr>
+          <w:rStyle w:val="VerbatimChar"/>
+        </w:rPr>
+        <w:t xml:space="preserve">: ? * " &lt; &gt; |</w:t>
+      </w:r>
+      <w:r>
+        <w:t xml:space="preserve">.</w:t>
+      </w:r>
+    </w:p>
+    <w:p>
+      <w:pPr>
+        <w:pStyle w:val="Heading3"/>
+      </w:pPr>
+      <w:bookmarkStart w:id="29" w:name="_automation"/>
+      <w:r>
+        <w:t xml:space="preserve">Automation</w:t>
+      </w:r>
+      <w:bookmarkEnd w:id="29"/>
+    </w:p>
+    <w:p>
+      <w:pPr>
+        <w:pStyle w:val="FirstParagraph"/>
+      </w:pPr>
+      <w:r>
+        <w:t xml:space="preserve">For hands-free use: start-up automation, an Automation menu item and shortcut (F4,</w:t>
+      </w:r>
+      <w:r>
+        <w:t xml:space="preserve"> </w:t>
+      </w:r>
+      <w:r>
+        <w:rPr>
+          <w:b/>
+          <w:bCs/>
+        </w:rPr>
+        <w:t xml:space="preserve">Start Auto Sequence</w:t>
+      </w:r>
+      <w:r>
+        <w:t xml:space="preserve">), an optional prompt before it starts, and what it does – download, delete from the card, eject, launch an application, exit. Safe delete and the trash folder name are set here too.</w:t>
+      </w:r>
+    </w:p>
+    <w:p>
+      <w:pPr>
+        <w:pStyle w:val="Heading3"/>
+      </w:pPr>
+      <w:bookmarkStart w:id="30" w:name="_mapping"/>
+      <w:r>
+        <w:t xml:space="preserve">Mapping</w:t>
+      </w:r>
+      <w:bookmarkEnd w:id="30"/>
+    </w:p>
+    <w:p>
+      <w:pPr>
+        <w:pStyle w:val="FirstParagraph"/>
+      </w:pPr>
+      <w:r>
+        <w:t xml:space="preserve">Gives each camera its own values for the</w:t>
+      </w:r>
+      <w:r>
+        <w:t xml:space="preserve"> </w:t>
+      </w:r>
+      <w:r>
+        <w:rPr>
+          <w:rStyle w:val="VerbatimChar"/>
+        </w:rPr>
+        <w:t xml:space="preserve">{T8}</w:t>
+      </w:r>
+      <w:r>
+        <w:t xml:space="preserve"> </w:t>
+      </w:r>
+      <w:r>
+        <w:t xml:space="preserve">and</w:t>
+      </w:r>
+      <w:r>
+        <w:t xml:space="preserve"> </w:t>
+      </w:r>
+      <w:r>
+        <w:rPr>
+          <w:rStyle w:val="VerbatimChar"/>
+        </w:rPr>
+        <w:t xml:space="preserve">{T9}</w:t>
+      </w:r>
+      <w:r>
+        <w:t xml:space="preserve"> </w:t>
+      </w:r>
+      <w:r>
+        <w:t xml:space="preserve">tokens, for example a short code per camera body. Add cameras with</w:t>
+      </w:r>
+      <w:r>
+        <w:t xml:space="preserve"> </w:t>
+      </w:r>
+      <w:r>
+        <w:rPr>
+          <w:b/>
+          <w:bCs/>
+        </w:rPr>
+        <w:t xml:space="preserve">Add camera…</w:t>
+      </w:r>
+      <w:r>
+        <w:t xml:space="preserve">; edit or delete entries with the buttons. Cameras can be identified by name or by serial number/owner string/user comment, and the program can ask when it meets a new camera.</w:t>
+      </w:r>
+    </w:p>
+    <w:p>
+      <w:pPr>
+        <w:pStyle w:val="Heading3"/>
+      </w:pPr>
+      <w:bookmarkStart w:id="31" w:name="_c02823a746ebaf499a7b8179d8ee10b9c460bba"/>
+      <w:r>
+        <w:t xml:space="preserve">Custom Button</w:t>
+      </w:r>
+      <w:bookmarkEnd w:id="31"/>
+    </w:p>
+    <w:p>
+      <w:pPr>
+        <w:pStyle w:val="FirstParagraph"/>
+      </w:pPr>
+      <w:r>
+        <w:t xml:space="preserve">Enable the button, set its caption and the command line.</w:t>
+      </w:r>
+    </w:p>
+    <w:p>
+      <w:pPr>
+        <w:pStyle w:val="Heading3"/>
+      </w:pPr>
+      <w:bookmarkStart w:id="32" w:name="_7fefb0e37b5304b8d54b3e10bc285efe9b76d35"/>
+      <w:r>
+        <w:t xml:space="preserve">Plug-ins</w:t>
+      </w:r>
+      <w:bookmarkEnd w:id="32"/>
+    </w:p>
+    <w:p>
+      <w:pPr>
+        <w:pStyle w:val="FirstParagraph"/>
+      </w:pPr>
+      <w:r>
+        <w:t xml:space="preserve">Lists the built-in plug-ins and any plug-in libraries found.</w:t>
+      </w:r>
+      <w:r>
+        <w:t xml:space="preserve"> </w:t>
+      </w:r>
+      <w:r>
+        <w:rPr>
+          <w:b/>
+          <w:bCs/>
+        </w:rPr>
+        <w:t xml:space="preserve">Directory Maker</w:t>
+      </w:r>
+      <w:r>
+        <w:t xml:space="preserve"> </w:t>
+      </w:r>
+      <w:r>
+        <w:t xml:space="preserve">works. The other built-in ones (JPEG auto profile, DNG Converter, JPEG resolution) are listed only and do nothing yet. The old Backup plug-in has been removed; backups are set with the backup folder on the Download Path tab.</w:t>
+      </w:r>
+    </w:p>
+    <w:p>
+      <w:pPr>
+        <w:pStyle w:val="BodyText"/>
+      </w:pPr>
+      <w:r>
+        <w:rPr>
+          <w:b/>
+          <w:bCs/>
+        </w:rPr>
+        <w:t xml:space="preserve">Plug-in libraries.</w:t>
+      </w:r>
+      <w:r>
+        <w:t xml:space="preserve"> </w:t>
+      </w:r>
+      <w:r>
+        <w:t xml:space="preserve">A plug-in library is a separate file that adds its own tokens to the folder and file name templates, for example to build folder names by an organization’s naming standard. Put the file into the</w:t>
+      </w:r>
+      <w:r>
+        <w:t xml:space="preserve"> </w:t>
+      </w:r>
+      <w:r>
+        <w:rPr>
+          <w:rStyle w:val="VerbatimChar"/>
+        </w:rPr>
         <w:t xml:space="preserve">plugins</w:t>
       </w:r>
       <w:r>
         <w:t xml:space="preserve"> </w:t>
       </w:r>
       <w:r>
-        <w:t xml:space="preserve">folder next to the program)</w:t>
-      </w:r>
-    </w:p>
-    <w:p>
-      <w:pPr>
-        <w:pStyle w:val="FirstParagraph"/>
-      </w:pPr>
-      <w:r>
-        <w:t xml:space="preserve">The next time the program starts, the library appears in the list as</w:t>
-      </w:r>
-      <w:r>
-        <w:t xml:space="preserve"> </w:t>
-      </w:r>
-      <w:r>
-        <w:rPr>
-          <w:b/>
-          <w:bCs/>
-        </w:rPr>
-        <w:t xml:space="preserve">name (library) - disabled</w:t>
-      </w:r>
-      <w:r>
-        <w:t xml:space="preserve">. Nothing of it runs yet. Select it and tick</w:t>
-      </w:r>
-      <w:r>
-        <w:t xml:space="preserve"> </w:t>
-      </w:r>
-      <w:r>
-        <w:rPr>
-          <w:b/>
-          <w:bCs/>
-        </w:rPr>
-        <w:t xml:space="preserve">Enable plug-in</w:t>
-      </w:r>
-      <w:r>
-        <w:t xml:space="preserve">: a message shows the full path of the file. Click</w:t>
-      </w:r>
-      <w:r>
-        <w:t xml:space="preserve"> </w:t>
-      </w:r>
-      <w:r>
-        <w:rPr>
-          <w:b/>
-          <w:bCs/>
-        </w:rPr>
-        <w:t xml:space="preserve">OK</w:t>
-      </w:r>
-      <w:r>
-        <w:t xml:space="preserve"> </w:t>
-      </w:r>
-      <w:r>
-        <w:t xml:space="preserve">only when you trust where the file came from, because a library runs with your rights. If a library cannot be loaded (for example a 32-bit or a Linux file on Windows), the program says why and switches it off. To remove a plug-in, delete its file from the</w:t>
-      </w:r>
-      <w:r>
-        <w:t xml:space="preserve"> </w:t>
-      </w:r>
-      <w:r>
-        <w:rPr>
-          <w:rStyle w:val="VerbatimChar"/>
-        </w:rPr>
-        <w:t xml:space="preserve">plugins</w:t>
-      </w:r>
-      <w:r>
-        <w:t xml:space="preserve"> </w:t>
-      </w:r>
-      <w:r>
-        <w:t xml:space="preserve">folder: at the next start it leaves the list. Its values are kept, so they are back if you install it again.</w:t>
-      </w:r>
-    </w:p>
-    <w:p>
-      <w:pPr>
-        <w:pStyle w:val="BodyText"/>
-      </w:pPr>
-      <w:r>
-        <w:t xml:space="preserve">Once it is switched on, the list shows the library’s own name, the information below the list names its tokens, and its logo (if it has one) is shown.</w:t>
-      </w:r>
-      <w:r>
-        <w:t xml:space="preserve"> </w:t>
-      </w:r>
-      <w:r>
-        <w:rPr>
-          <w:b/>
-          <w:bCs/>
-        </w:rPr>
-        <w:t xml:space="preserve">Setup…</w:t>
-      </w:r>
-      <w:r>
-        <w:t xml:space="preserve"> </w:t>
-      </w:r>
-      <w:r>
-        <w:t xml:space="preserve">opens the library’s window for its values. The same window opens each time you click</w:t>
-      </w:r>
-      <w:r>
-        <w:t xml:space="preserve"> </w:t>
-      </w:r>
-      <w:r>
-        <w:rPr>
-          <w:b/>
-          <w:bCs/>
-        </w:rPr>
-        <w:t xml:space="preserve">Download</w:t>
-      </w:r>
-      <w:r>
-        <w:t xml:space="preserve">, filled with the last values; check them and click</w:t>
-      </w:r>
-      <w:r>
-        <w:t xml:space="preserve"> </w:t>
-      </w:r>
-      <w:r>
-        <w:rPr>
-          <w:b/>
-          <w:bCs/>
-        </w:rPr>
-        <w:t xml:space="preserve">OK</w:t>
-      </w:r>
-      <w:r>
-        <w:t xml:space="preserve">.</w:t>
-      </w:r>
-      <w:r>
-        <w:t xml:space="preserve"> </w:t>
-      </w:r>
-      <w:r>
-        <w:rPr>
-          <w:b/>
-          <w:bCs/>
-        </w:rPr>
-        <w:t xml:space="preserve">Cancel</w:t>
-      </w:r>
-      <w:r>
-        <w:t xml:space="preserve"> </w:t>
-      </w:r>
-      <w:r>
-        <w:t xml:space="preserve">stops the download before anything is copied.</w:t>
-      </w:r>
-      <w:r>
-        <w:t xml:space="preserve"> </w:t>
-      </w:r>
-      <w:r>
-        <w:rPr>
-          <w:b/>
-          <w:bCs/>
-        </w:rPr>
-        <w:t xml:space="preserve">OK</w:t>
-      </w:r>
-      <w:r>
-        <w:t xml:space="preserve"> </w:t>
-      </w:r>
-      <w:r>
-        <w:t xml:space="preserve">is only available when the values are valid. If the library offers a</w:t>
-      </w:r>
-      <w:r>
-        <w:t xml:space="preserve"> </w:t>
-      </w:r>
-      <w:r>
-        <w:rPr>
-          <w:b/>
-          <w:bCs/>
-        </w:rPr>
-        <w:t xml:space="preserve">Destination folder…</w:t>
-      </w:r>
-      <w:r>
-        <w:t xml:space="preserve"> </w:t>
-      </w:r>
-      <w:r>
-        <w:t xml:space="preserve">button, use it to choose the folder to download to. The download folder on the Download Path tab is set to that folder plus the library’s folder layout (for example a project folder named from the values, then a folder per day and job code); the window shows the result as</w:t>
-      </w:r>
-      <w:r>
-        <w:t xml:space="preserve"> </w:t>
-      </w:r>
-      <w:r>
-        <w:rPr>
-          <w:b/>
-          <w:bCs/>
-        </w:rPr>
-        <w:t xml:space="preserve">Download to:</w:t>
-      </w:r>
-      <w:r>
-        <w:t xml:space="preserve">. A library can also offer check boxes that change the last folder of the download path, for example one folder per type of file; the</w:t>
-      </w:r>
-      <w:r>
-        <w:t xml:space="preserve"> </w:t>
-      </w:r>
-      <w:r>
-        <w:rPr>
-          <w:b/>
-          <w:bCs/>
-        </w:rPr>
-        <w:t xml:space="preserve">Download to:</w:t>
-      </w:r>
-      <w:r>
-        <w:t xml:space="preserve"> </w:t>
-      </w:r>
-      <w:r>
-        <w:t xml:space="preserve">line follows the box. The library’s version is shown in the window’s title bar. Use the library’s tokens in the templates on the Download Path tab like any other token; the</w:t>
-      </w:r>
-      <w:r>
-        <w:t xml:space="preserve"> </w:t>
-      </w:r>
-      <w:r>
-        <w:rPr>
-          <w:b/>
-          <w:bCs/>
-        </w:rPr>
-        <w:t xml:space="preserve">Example image</w:t>
-      </w:r>
-      <w:r>
-        <w:t xml:space="preserve"> </w:t>
-      </w:r>
-      <w:r>
-        <w:t xml:space="preserve">line shows the result. A token whose value is missing stays in the name as written (for example</w:t>
-      </w:r>
-      <w:r>
-        <w:t xml:space="preserve"> </w:t>
-      </w:r>
-      <w:r>
-        <w:rPr>
-          <w:rStyle w:val="VerbatimChar"/>
-        </w:rPr>
-        <w:t xml:space="preserve">{ABC}</w:t>
-      </w:r>
-      <w:r>
-        <w:t xml:space="preserve">), so you can see it.</w:t>
-      </w:r>
-    </w:p>
-    <w:p>
-      <w:pPr>
-        <w:pStyle w:val="BodyText"/>
-      </w:pPr>
-      <w:r>
-        <w:t xml:space="preserve">The interface for writing libraries is described in</w:t>
-      </w:r>
-      <w:r>
-        <w:t xml:space="preserve"> </w:t>
-      </w:r>
-      <w:r>
-        <w:rPr>
-          <w:rStyle w:val="VerbatimChar"/>
-        </w:rPr>
-        <w:t xml:space="preserve">docs/Plugin_Developer_Manual.md</w:t>
-      </w:r>
-      <w:r>
-        <w:t xml:space="preserve">.</w:t>
-      </w:r>
-    </w:p>
-    <w:p>
-      <w:pPr>
-        <w:pStyle w:val="Heading2"/>
-      </w:pPr>
-      <w:bookmarkStart w:id="33" w:name="_0d4b39ebfeff99b6779dabe48e67e9ba18ef00a"/>
-      <w:r>
-        <w:t xml:space="preserve">13. User profiles and exporting settings</w:t>
-      </w:r>
-      <w:bookmarkEnd w:id="33"/>
-    </w:p>
-    <w:p>
-      <w:pPr>
-        <w:pStyle w:val="FirstParagraph"/>
-      </w:pPr>
-      <w:r>
-        <w:t xml:space="preserve">A</w:t>
-      </w:r>
-      <w:r>
-        <w:t xml:space="preserve"> </w:t>
-      </w:r>
-      <w:r>
-        <w:rPr>
-          <w:b/>
-          <w:bCs/>
-        </w:rPr>
-        <w:t xml:space="preserve">profile</w:t>
-      </w:r>
-      <w:r>
-        <w:t xml:space="preserve"> </w:t>
-      </w:r>
-      <w:r>
-        <w:t xml:space="preserve">is a saved set of preferences – useful if you use several cameras, clients or computers.</w:t>
+        <w:t xml:space="preserve">folder:</w:t>
       </w:r>
     </w:p>
     <w:p>
@@ -7555,55 +7238,49 @@
         </w:numPr>
       </w:pPr>
       <w:r>
-        <w:t xml:space="preserve">File &gt; User Profiles &gt;</w:t>
-      </w:r>
-      <w:r>
-        <w:t xml:space="preserve"> </w:t>
-      </w:r>
-      <w:r>
-        <w:rPr>
-          <w:b/>
-          <w:bCs/>
-        </w:rPr>
-        <w:t xml:space="preserve">Save</w:t>
-      </w:r>
-      <w:r>
-        <w:t xml:space="preserve"> </w:t>
-      </w:r>
-      <w:r>
-        <w:t xml:space="preserve">stores the current settings under a name;</w:t>
-      </w:r>
-      <w:r>
-        <w:t xml:space="preserve"> </w:t>
-      </w:r>
-      <w:r>
-        <w:rPr>
-          <w:b/>
-          <w:bCs/>
-        </w:rPr>
-        <w:t xml:space="preserve">Load</w:t>
-      </w:r>
-      <w:r>
-        <w:t xml:space="preserve"> </w:t>
-      </w:r>
-      <w:r>
-        <w:t xml:space="preserve">applies one;</w:t>
-      </w:r>
-      <w:r>
-        <w:t xml:space="preserve"> </w:t>
-      </w:r>
-      <w:r>
-        <w:rPr>
-          <w:b/>
-          <w:bCs/>
-        </w:rPr>
-        <w:t xml:space="preserve">Delete</w:t>
-      </w:r>
-      <w:r>
-        <w:t xml:space="preserve"> </w:t>
-      </w:r>
-      <w:r>
-        <w:t xml:space="preserve">removes one. In the Load window (and the start-up profile list), double-clicking a profile loads it.</w:t>
+        <w:t xml:space="preserve">Windows:</w:t>
+      </w:r>
+      <w:r>
+        <w:t xml:space="preserve"> </w:t>
+      </w:r>
+      <w:r>
+        <w:rPr>
+          <w:rStyle w:val="VerbatimChar"/>
+        </w:rPr>
+        <w:t xml:space="preserve">%LOCALAPPDATA%\Photo Downloader\plugins\name.dll</w:t>
+      </w:r>
+      <w:r>
+        <w:t xml:space="preserve"> </w:t>
+      </w:r>
+      <w:r>
+        <w:t xml:space="preserve">(or a</w:t>
+      </w:r>
+      <w:r>
+        <w:t xml:space="preserve"> </w:t>
+      </w:r>
+      <w:r>
+        <w:rPr>
+          <w:rStyle w:val="VerbatimChar"/>
+        </w:rPr>
+        <w:t xml:space="preserve">plugins</w:t>
+      </w:r>
+      <w:r>
+        <w:t xml:space="preserve"> </w:t>
+      </w:r>
+      <w:r>
+        <w:t xml:space="preserve">folder next to</w:t>
+      </w:r>
+      <w:r>
+        <w:t xml:space="preserve"> </w:t>
+      </w:r>
+      <w:r>
+        <w:rPr>
+          <w:rStyle w:val="VerbatimChar"/>
+        </w:rPr>
+        <w:t xml:space="preserve">PhotoDownloader.exe</w:t>
+      </w:r>
+      <w:r>
+        <w:t xml:space="preserve">)</w:t>
       </w:r>
     </w:p>
     <w:p>
@@ -7615,33 +7292,324 @@
         </w:numPr>
       </w:pPr>
       <w:r>
-        <w:rPr>
-          <w:b/>
-          <w:bCs/>
-        </w:rPr>
-        <w:t xml:space="preserve">Save</w:t>
-      </w:r>
-      <w:r>
-        <w:t xml:space="preserve"> </w:t>
-      </w:r>
-      <w:r>
-        <w:t xml:space="preserve">lists the saved profiles and fills in the name of the profile in use (the one loaded or saved last). Click</w:t>
-      </w:r>
-      <w:r>
-        <w:t xml:space="preserve"> </w:t>
-      </w:r>
-      <w:r>
-        <w:rPr>
-          <w:b/>
-          <w:bCs/>
-        </w:rPr>
-        <w:t xml:space="preserve">Save</w:t>
-      </w:r>
-      <w:r>
-        <w:t xml:space="preserve"> </w:t>
-      </w:r>
-      <w:r>
-        <w:t xml:space="preserve">to update that profile, click another profile in the list (double-click saves at once) to save over it, or type a new name. Saving over a profile asks for confirmation first.</w:t>
+        <w:t xml:space="preserve">Linux:</w:t>
+      </w:r>
+      <w:r>
+        <w:t xml:space="preserve"> </w:t>
+      </w:r>
+      <w:r>
+        <w:rPr>
+          <w:rStyle w:val="VerbatimChar"/>
+        </w:rPr>
+        <w:t xml:space="preserve">~/.config/Photo Downloader/plugins/libname.so</w:t>
+      </w:r>
+      <w:r>
+        <w:t xml:space="preserve"> </w:t>
+      </w:r>
+      <w:r>
+        <w:t xml:space="preserve">(or a</w:t>
+      </w:r>
+      <w:r>
+        <w:t xml:space="preserve"> </w:t>
+      </w:r>
+      <w:r>
+        <w:rPr>
+          <w:rStyle w:val="VerbatimChar"/>
+        </w:rPr>
+        <w:t xml:space="preserve">plugins</w:t>
+      </w:r>
+      <w:r>
+        <w:t xml:space="preserve"> </w:t>
+      </w:r>
+      <w:r>
+        <w:t xml:space="preserve">folder next to the program)</w:t>
+      </w:r>
+    </w:p>
+    <w:p>
+      <w:pPr>
+        <w:pStyle w:val="FirstParagraph"/>
+      </w:pPr>
+      <w:r>
+        <w:t xml:space="preserve">The next time the program starts, the library appears in the list as</w:t>
+      </w:r>
+      <w:r>
+        <w:t xml:space="preserve"> </w:t>
+      </w:r>
+      <w:r>
+        <w:rPr>
+          <w:b/>
+          <w:bCs/>
+        </w:rPr>
+        <w:t xml:space="preserve">name (library) - disabled</w:t>
+      </w:r>
+      <w:r>
+        <w:t xml:space="preserve">. Nothing of it runs yet. Select it and tick</w:t>
+      </w:r>
+      <w:r>
+        <w:t xml:space="preserve"> </w:t>
+      </w:r>
+      <w:r>
+        <w:rPr>
+          <w:b/>
+          <w:bCs/>
+        </w:rPr>
+        <w:t xml:space="preserve">Enable plug-in</w:t>
+      </w:r>
+      <w:r>
+        <w:t xml:space="preserve">: a message shows the full path of the file. Click</w:t>
+      </w:r>
+      <w:r>
+        <w:t xml:space="preserve"> </w:t>
+      </w:r>
+      <w:r>
+        <w:rPr>
+          <w:b/>
+          <w:bCs/>
+        </w:rPr>
+        <w:t xml:space="preserve">OK</w:t>
+      </w:r>
+      <w:r>
+        <w:t xml:space="preserve"> </w:t>
+      </w:r>
+      <w:r>
+        <w:t xml:space="preserve">only when you trust where the file came from, because a library runs with your rights. If a library cannot be loaded (for example a 32-bit or a Linux file on Windows), the program says why and switches it off. To remove a plug-in, delete its file from the</w:t>
+      </w:r>
+      <w:r>
+        <w:t xml:space="preserve"> </w:t>
+      </w:r>
+      <w:r>
+        <w:rPr>
+          <w:rStyle w:val="VerbatimChar"/>
+        </w:rPr>
+        <w:t xml:space="preserve">plugins</w:t>
+      </w:r>
+      <w:r>
+        <w:t xml:space="preserve"> </w:t>
+      </w:r>
+      <w:r>
+        <w:t xml:space="preserve">folder: at the next start it leaves the list. Its values are kept, so they are back if you install it again.</w:t>
+      </w:r>
+    </w:p>
+    <w:p>
+      <w:pPr>
+        <w:pStyle w:val="BodyText"/>
+      </w:pPr>
+      <w:r>
+        <w:t xml:space="preserve">Once it is switched on, the list shows the library’s own name, the information below the list names its tokens, and its logo (if it has one) is shown.</w:t>
+      </w:r>
+      <w:r>
+        <w:t xml:space="preserve"> </w:t>
+      </w:r>
+      <w:r>
+        <w:rPr>
+          <w:b/>
+          <w:bCs/>
+        </w:rPr>
+        <w:t xml:space="preserve">Setup…</w:t>
+      </w:r>
+      <w:r>
+        <w:t xml:space="preserve"> </w:t>
+      </w:r>
+      <w:r>
+        <w:t xml:space="preserve">opens the library’s window for its values. The same window opens each time you start a download (</w:t>
+      </w:r>
+      <w:r>
+        <w:rPr>
+          <w:b/>
+          <w:bCs/>
+        </w:rPr>
+        <w:t xml:space="preserve">Download Selected</w:t>
+      </w:r>
+      <w:r>
+        <w:t xml:space="preserve"> </w:t>
+      </w:r>
+      <w:r>
+        <w:t xml:space="preserve">or</w:t>
+      </w:r>
+      <w:r>
+        <w:t xml:space="preserve"> </w:t>
+      </w:r>
+      <w:r>
+        <w:rPr>
+          <w:b/>
+          <w:bCs/>
+        </w:rPr>
+        <w:t xml:space="preserve">Download All</w:t>
+      </w:r>
+      <w:r>
+        <w:t xml:space="preserve">), filled with the last values; check them and click</w:t>
+      </w:r>
+      <w:r>
+        <w:t xml:space="preserve"> </w:t>
+      </w:r>
+      <w:r>
+        <w:rPr>
+          <w:b/>
+          <w:bCs/>
+        </w:rPr>
+        <w:t xml:space="preserve">OK</w:t>
+      </w:r>
+      <w:r>
+        <w:t xml:space="preserve">.</w:t>
+      </w:r>
+      <w:r>
+        <w:t xml:space="preserve"> </w:t>
+      </w:r>
+      <w:r>
+        <w:rPr>
+          <w:b/>
+          <w:bCs/>
+        </w:rPr>
+        <w:t xml:space="preserve">Cancel</w:t>
+      </w:r>
+      <w:r>
+        <w:t xml:space="preserve"> </w:t>
+      </w:r>
+      <w:r>
+        <w:t xml:space="preserve">stops the download before anything is copied.</w:t>
+      </w:r>
+      <w:r>
+        <w:t xml:space="preserve"> </w:t>
+      </w:r>
+      <w:r>
+        <w:rPr>
+          <w:b/>
+          <w:bCs/>
+        </w:rPr>
+        <w:t xml:space="preserve">OK</w:t>
+      </w:r>
+      <w:r>
+        <w:t xml:space="preserve"> </w:t>
+      </w:r>
+      <w:r>
+        <w:t xml:space="preserve">is only available when the values are valid. If the library offers a</w:t>
+      </w:r>
+      <w:r>
+        <w:t xml:space="preserve"> </w:t>
+      </w:r>
+      <w:r>
+        <w:rPr>
+          <w:b/>
+          <w:bCs/>
+        </w:rPr>
+        <w:t xml:space="preserve">Destination folder…</w:t>
+      </w:r>
+      <w:r>
+        <w:t xml:space="preserve"> </w:t>
+      </w:r>
+      <w:r>
+        <w:t xml:space="preserve">button, use it to choose the folder to download to. The download folder on the Download Path tab is set to that folder plus the library’s folder layout (for example a project folder named from the values, then a folder per day and job code); the window shows the result as</w:t>
+      </w:r>
+      <w:r>
+        <w:t xml:space="preserve"> </w:t>
+      </w:r>
+      <w:r>
+        <w:rPr>
+          <w:b/>
+          <w:bCs/>
+        </w:rPr>
+        <w:t xml:space="preserve">Download to:</w:t>
+      </w:r>
+      <w:r>
+        <w:t xml:space="preserve">. A library can also offer check boxes that change the last folder of the download path, for example one folder per type of file; the</w:t>
+      </w:r>
+      <w:r>
+        <w:t xml:space="preserve"> </w:t>
+      </w:r>
+      <w:r>
+        <w:rPr>
+          <w:b/>
+          <w:bCs/>
+        </w:rPr>
+        <w:t xml:space="preserve">Download to:</w:t>
+      </w:r>
+      <w:r>
+        <w:t xml:space="preserve"> </w:t>
+      </w:r>
+      <w:r>
+        <w:t xml:space="preserve">line follows the box. The library’s version is shown in the window’s title bar. Use the library’s tokens in the templates on the Download Path tab like any other token; the</w:t>
+      </w:r>
+      <w:r>
+        <w:t xml:space="preserve"> </w:t>
+      </w:r>
+      <w:r>
+        <w:rPr>
+          <w:b/>
+          <w:bCs/>
+        </w:rPr>
+        <w:t xml:space="preserve">Example image</w:t>
+      </w:r>
+      <w:r>
+        <w:t xml:space="preserve"> </w:t>
+      </w:r>
+      <w:r>
+        <w:t xml:space="preserve">line shows the result. A token whose value is missing stays in the name as written (for example</w:t>
+      </w:r>
+      <w:r>
+        <w:t xml:space="preserve"> </w:t>
+      </w:r>
+      <w:r>
+        <w:rPr>
+          <w:rStyle w:val="VerbatimChar"/>
+        </w:rPr>
+        <w:t xml:space="preserve">{ABC}</w:t>
+      </w:r>
+      <w:r>
+        <w:t xml:space="preserve">), so you can see it.</w:t>
+      </w:r>
+    </w:p>
+    <w:p>
+      <w:pPr>
+        <w:pStyle w:val="BodyText"/>
+      </w:pPr>
+      <w:r>
+        <w:t xml:space="preserve">The interface for writing libraries is described in</w:t>
+      </w:r>
+      <w:r>
+        <w:t xml:space="preserve"> </w:t>
+      </w:r>
+      <w:r>
+        <w:rPr>
+          <w:rStyle w:val="VerbatimChar"/>
+        </w:rPr>
+        <w:t xml:space="preserve">docs/Plugin_Developer_Manual.md</w:t>
+      </w:r>
+      <w:r>
+        <w:t xml:space="preserve">.</w:t>
+      </w:r>
+    </w:p>
+    <w:p>
+      <w:pPr>
+        <w:pStyle w:val="Heading2"/>
+      </w:pPr>
+      <w:bookmarkStart w:id="33" w:name="_0d4b39ebfeff99b6779dabe48e67e9ba18ef00a"/>
+      <w:r>
+        <w:t xml:space="preserve">13. User profiles and exporting settings</w:t>
+      </w:r>
+      <w:bookmarkEnd w:id="33"/>
+    </w:p>
+    <w:p>
+      <w:pPr>
+        <w:pStyle w:val="FirstParagraph"/>
+      </w:pPr>
+      <w:r>
+        <w:t xml:space="preserve">A</w:t>
+      </w:r>
+      <w:r>
+        <w:t xml:space="preserve"> </w:t>
+      </w:r>
+      <w:r>
+        <w:rPr>
+          <w:b/>
+          <w:bCs/>
+        </w:rPr>
+        <w:t xml:space="preserve">profile</w:t>
+      </w:r>
+      <w:r>
+        <w:t xml:space="preserve"> </w:t>
+      </w:r>
+      <w:r>
+        <w:t xml:space="preserve">is a saved set of preferences – useful if you use several cameras, clients or computers.</w:t>
       </w:r>
     </w:p>
     <w:p>
@@ -7649,24 +7617,59 @@
         <w:pStyle w:val="Compact"/>
         <w:numPr>
           <w:ilvl w:val="0"/>
-          <w:numId w:val="1016"/>
+          <w:numId w:val="1017"/>
         </w:numPr>
       </w:pPr>
       <w:r>
-        <w:t xml:space="preserve">A profile holds all preferences, including the</w:t>
-      </w:r>
-      <w:r>
-        <w:t xml:space="preserve"> </w:t>
-      </w:r>
-      <w:r>
-        <w:rPr>
-          <w:b/>
-          <w:bCs/>
-        </w:rPr>
-        <w:t xml:space="preserve">plug-ins</w:t>
-      </w:r>
-      <w:r>
-        <w:t xml:space="preserve">: which are switched on, their order, and the values entered in a plug-in’s window (with the download path it set). Loading a profile switches the plug-ins on or off as saved; a plug-in library that is missing on this computer is switched off with a message.</w:t>
+        <w:t xml:space="preserve">File &gt; User Profiles &gt;</w:t>
+      </w:r>
+      <w:r>
+        <w:t xml:space="preserve"> </w:t>
+      </w:r>
+      <w:r>
+        <w:rPr>
+          <w:b/>
+          <w:bCs/>
+        </w:rPr>
+        <w:t xml:space="preserve">Save</w:t>
+      </w:r>
+      <w:r>
+        <w:t xml:space="preserve"> </w:t>
+      </w:r>
+      <w:r>
+        <w:t xml:space="preserve">stores the current settings under a name;</w:t>
+      </w:r>
+      <w:r>
+        <w:t xml:space="preserve"> </w:t>
+      </w:r>
+      <w:r>
+        <w:rPr>
+          <w:b/>
+          <w:bCs/>
+        </w:rPr>
+        <w:t xml:space="preserve">Load</w:t>
+      </w:r>
+      <w:r>
+        <w:t xml:space="preserve"> </w:t>
+      </w:r>
+      <w:r>
+        <w:t xml:space="preserve">applies one;</w:t>
+      </w:r>
+      <w:r>
+        <w:t xml:space="preserve"> </w:t>
+      </w:r>
+      <w:r>
+        <w:rPr>
+          <w:b/>
+          <w:bCs/>
+        </w:rPr>
+        <w:t xml:space="preserve">Delete</w:t>
+      </w:r>
+      <w:r>
+        <w:t xml:space="preserve"> </w:t>
+      </w:r>
+      <w:r>
+        <w:t xml:space="preserve">removes one. In the Load window (and the start-up profile list), double-clicking a profile loads it.</w:t>
       </w:r>
     </w:p>
     <w:p>
@@ -7674,36 +7677,37 @@
         <w:pStyle w:val="Compact"/>
         <w:numPr>
           <w:ilvl w:val="0"/>
-          <w:numId w:val="1016"/>
+          <w:numId w:val="1017"/>
         </w:numPr>
       </w:pPr>
       <w:r>
-        <w:t xml:space="preserve">With</w:t>
-      </w:r>
-      <w:r>
-        <w:t xml:space="preserve"> </w:t>
-      </w:r>
-      <w:r>
-        <w:t xml:space="preserve">“Prompt for user profile at start-up”</w:t>
-      </w:r>
-      <w:r>
-        <w:t xml:space="preserve">, a list appears each time the program starts. The entry</w:t>
-      </w:r>
-      <w:r>
-        <w:t xml:space="preserve"> </w:t>
-      </w:r>
-      <w:r>
-        <w:rPr>
-          <w:b/>
-          <w:bCs/>
-        </w:rPr>
-        <w:t xml:space="preserve">Default</w:t>
-      </w:r>
-      <w:r>
-        <w:t xml:space="preserve"> </w:t>
-      </w:r>
-      <w:r>
-        <w:t xml:space="preserve">keeps your current settings.</w:t>
+        <w:rPr>
+          <w:b/>
+          <w:bCs/>
+        </w:rPr>
+        <w:t xml:space="preserve">Save</w:t>
+      </w:r>
+      <w:r>
+        <w:t xml:space="preserve"> </w:t>
+      </w:r>
+      <w:r>
+        <w:t xml:space="preserve">lists the saved profiles and fills in the name of the profile in use (the one loaded or saved last). Click</w:t>
+      </w:r>
+      <w:r>
+        <w:t xml:space="preserve"> </w:t>
+      </w:r>
+      <w:r>
+        <w:rPr>
+          <w:b/>
+          <w:bCs/>
+        </w:rPr>
+        <w:t xml:space="preserve">Save</w:t>
+      </w:r>
+      <w:r>
+        <w:t xml:space="preserve"> </w:t>
+      </w:r>
+      <w:r>
+        <w:t xml:space="preserve">to update that profile, click another profile in the list (double-click saves at once) to save over it, or type a new name. Saving over a profile asks for confirmation first.</w:t>
       </w:r>
     </w:p>
     <w:p>
@@ -7711,7 +7715,69 @@
         <w:pStyle w:val="Compact"/>
         <w:numPr>
           <w:ilvl w:val="0"/>
-          <w:numId w:val="1016"/>
+          <w:numId w:val="1017"/>
+        </w:numPr>
+      </w:pPr>
+      <w:r>
+        <w:t xml:space="preserve">A profile holds all preferences, including the</w:t>
+      </w:r>
+      <w:r>
+        <w:t xml:space="preserve"> </w:t>
+      </w:r>
+      <w:r>
+        <w:rPr>
+          <w:b/>
+          <w:bCs/>
+        </w:rPr>
+        <w:t xml:space="preserve">plug-ins</w:t>
+      </w:r>
+      <w:r>
+        <w:t xml:space="preserve">: which are switched on, their order, and the values entered in a plug-in’s window (with the download path it set). Loading a profile switches the plug-ins on or off as saved; a plug-in library that is missing on this computer is switched off with a message.</w:t>
+      </w:r>
+    </w:p>
+    <w:p>
+      <w:pPr>
+        <w:pStyle w:val="Compact"/>
+        <w:numPr>
+          <w:ilvl w:val="0"/>
+          <w:numId w:val="1017"/>
+        </w:numPr>
+      </w:pPr>
+      <w:r>
+        <w:t xml:space="preserve">With</w:t>
+      </w:r>
+      <w:r>
+        <w:t xml:space="preserve"> </w:t>
+      </w:r>
+      <w:r>
+        <w:t xml:space="preserve">“Prompt for user profile at start-up”</w:t>
+      </w:r>
+      <w:r>
+        <w:t xml:space="preserve">, a list appears each time the program starts. The entry</w:t>
+      </w:r>
+      <w:r>
+        <w:t xml:space="preserve"> </w:t>
+      </w:r>
+      <w:r>
+        <w:rPr>
+          <w:b/>
+          <w:bCs/>
+        </w:rPr>
+        <w:t xml:space="preserve">Default</w:t>
+      </w:r>
+      <w:r>
+        <w:t xml:space="preserve"> </w:t>
+      </w:r>
+      <w:r>
+        <w:t xml:space="preserve">keeps your current settings.</w:t>
+      </w:r>
+    </w:p>
+    <w:p>
+      <w:pPr>
+        <w:pStyle w:val="Compact"/>
+        <w:numPr>
+          <w:ilvl w:val="0"/>
+          <w:numId w:val="1017"/>
         </w:numPr>
       </w:pPr>
       <w:r>
@@ -8295,7 +8361,7 @@
         <w:pStyle w:val="Compact"/>
         <w:numPr>
           <w:ilvl w:val="0"/>
-          <w:numId w:val="1017"/>
+          <w:numId w:val="1018"/>
         </w:numPr>
       </w:pPr>
       <w:r>
@@ -8323,7 +8389,7 @@
         <w:pStyle w:val="Compact"/>
         <w:numPr>
           <w:ilvl w:val="0"/>
-          <w:numId w:val="1017"/>
+          <w:numId w:val="1018"/>
         </w:numPr>
       </w:pPr>
       <w:r>
@@ -9514,7 +9580,7 @@
         <w:pStyle w:val="Compact"/>
         <w:numPr>
           <w:ilvl w:val="0"/>
-          <w:numId w:val="1018"/>
+          <w:numId w:val="1019"/>
         </w:numPr>
       </w:pPr>
       <w:r>
@@ -9537,7 +9603,7 @@
         <w:pStyle w:val="Compact"/>
         <w:numPr>
           <w:ilvl w:val="0"/>
-          <w:numId w:val="1018"/>
+          <w:numId w:val="1019"/>
         </w:numPr>
       </w:pPr>
       <w:r>
@@ -9566,7 +9632,7 @@
         <w:pStyle w:val="Compact"/>
         <w:numPr>
           <w:ilvl w:val="0"/>
-          <w:numId w:val="1018"/>
+          <w:numId w:val="1019"/>
         </w:numPr>
       </w:pPr>
       <w:r>
@@ -10035,6 +10101,9 @@
     <w:abstractNumId w:val="991"/>
   </w:num>
   <w:num w:numId="1012">
+    <w:abstractNumId w:val="991"/>
+  </w:num>
+  <w:num w:numId="1013">
     <w:abstractNumId w:val="99411"/>
     <w:lvlOverride w:ilvl="0">
       <w:startOverride w:val="1"/>
@@ -10064,9 +10133,6 @@
       <w:startOverride w:val="1"/>
     </w:lvlOverride>
   </w:num>
-  <w:num w:numId="1013">
-    <w:abstractNumId w:val="991"/>
-  </w:num>
   <w:num w:numId="1014">
     <w:abstractNumId w:val="991"/>
   </w:num>
@@ -10080,6 +10146,9 @@
     <w:abstractNumId w:val="991"/>
   </w:num>
   <w:num w:numId="1018">
+    <w:abstractNumId w:val="991"/>
+  </w:num>
+  <w:num w:numId="1019">
     <w:abstractNumId w:val="991"/>
   </w:num>
 </w:numbering>

</xml_diff>

<commit_message>
Profiles keep the download path last used
After a download, the download path is written into the user profile in use
(only that key), so loading the profile downloads to the same place. Picking
Default at start-up (no Default.ini) means no profile is in use. Build 203.

Co-Authored-By: Claude Opus 5.5 <noreply@anthropic.com>
</commit_message>
<xml_diff>
--- a/GitHub/docs/User_Manual.docx
+++ b/GitHub/docs/User_Manual.docx
@@ -7708,6 +7708,70 @@
       </w:r>
       <w:r>
         <w:t xml:space="preserve">to update that profile, click another profile in the list (double-click saves at once) to save over it, or type a new name. Saving over a profile asks for confirmation first.</w:t>
+      </w:r>
+    </w:p>
+    <w:p>
+      <w:pPr>
+        <w:pStyle w:val="Compact"/>
+        <w:numPr>
+          <w:ilvl w:val="0"/>
+          <w:numId w:val="1017"/>
+        </w:numPr>
+      </w:pPr>
+      <w:r>
+        <w:rPr>
+          <w:b/>
+          <w:bCs/>
+        </w:rPr>
+        <w:t xml:space="preserve">The download path follows the profile.</w:t>
+      </w:r>
+      <w:r>
+        <w:t xml:space="preserve"> </w:t>
+      </w:r>
+      <w:r>
+        <w:t xml:space="preserve">After each download, the download path that was used is written into the profile in use, so loading that profile later downloads to the same place, even when the path was changed after the profile was saved (for example with a plug-in’s</w:t>
+      </w:r>
+      <w:r>
+        <w:t xml:space="preserve"> </w:t>
+      </w:r>
+      <w:r>
+        <w:rPr>
+          <w:b/>
+          <w:bCs/>
+        </w:rPr>
+        <w:t xml:space="preserve">Destination folder…</w:t>
+      </w:r>
+      <w:r>
+        <w:t xml:space="preserve">). Only the download path is updated; other changes still need</w:t>
+      </w:r>
+      <w:r>
+        <w:t xml:space="preserve"> </w:t>
+      </w:r>
+      <w:r>
+        <w:rPr>
+          <w:b/>
+          <w:bCs/>
+        </w:rPr>
+        <w:t xml:space="preserve">Save</w:t>
+      </w:r>
+      <w:r>
+        <w:t xml:space="preserve">. Choosing</w:t>
+      </w:r>
+      <w:r>
+        <w:t xml:space="preserve"> </w:t>
+      </w:r>
+      <w:r>
+        <w:rPr>
+          <w:b/>
+          <w:bCs/>
+        </w:rPr>
+        <w:t xml:space="preserve">Default</w:t>
+      </w:r>
+      <w:r>
+        <w:t xml:space="preserve"> </w:t>
+      </w:r>
+      <w:r>
+        <w:t xml:space="preserve">at start-up means no profile is in use.</w:t>
       </w:r>
     </w:p>
     <w:p>

</xml_diff>

<commit_message>
Profiles also keep the plug-in values last used
After a download, the plug-in values ([PluginOpts]) are written into the user
profile in use together with the download path. Build 204.

Co-Authored-By: Claude Opus 5.5 <noreply@anthropic.com>
</commit_message>
<xml_diff>
--- a/GitHub/docs/User_Manual.docx
+++ b/GitHub/docs/User_Manual.docx
@@ -7723,26 +7723,13 @@
           <w:b/>
           <w:bCs/>
         </w:rPr>
-        <w:t xml:space="preserve">The download path follows the profile.</w:t>
-      </w:r>
-      <w:r>
-        <w:t xml:space="preserve"> </w:t>
-      </w:r>
-      <w:r>
-        <w:t xml:space="preserve">After each download, the download path that was used is written into the profile in use, so loading that profile later downloads to the same place, even when the path was changed after the profile was saved (for example with a plug-in’s</w:t>
-      </w:r>
-      <w:r>
-        <w:t xml:space="preserve"> </w:t>
-      </w:r>
-      <w:r>
-        <w:rPr>
-          <w:b/>
-          <w:bCs/>
-        </w:rPr>
-        <w:t xml:space="preserve">Destination folder…</w:t>
-      </w:r>
-      <w:r>
-        <w:t xml:space="preserve">). Only the download path is updated; other changes still need</w:t>
+        <w:t xml:space="preserve">The download path and plug-in values follow the profile.</w:t>
+      </w:r>
+      <w:r>
+        <w:t xml:space="preserve"> </w:t>
+      </w:r>
+      <w:r>
+        <w:t xml:space="preserve">After each download, the download path and the plug-in values that were used are written into the profile in use, so loading that profile later downloads to the same place with the same plug-in values, even when they were changed after the profile was saved (for example in a plug-in’s window). Only these are updated; other changes still need</w:t>
       </w:r>
       <w:r>
         <w:t xml:space="preserve"> </w:t>

</xml_diff>

<commit_message>
Plug-in steps after each file: JPEG auto profile and DNG Converter program plug-ins
- After each file is downloaded, verified and backed up, switched-on plug-ins
  work on the downloaded copy in list order (never the backup or the original).
  A failed step switches its plug-in off and keeps the original from deletion;
  a message lists the failures at the end of the download.
- JPEG auto profile (built in, uIccEmbed.pas): an ICC profile per camera model
  and a default, embedded as APP2 segments without recompressing the picture.
- Program plug-ins (uExtPlugin.pas): a .plugin.ini file names a program and its
  arguments; run without a shell, with a timeout. plugins/dng-converter has
  plug-ins for Adobe DNG Converter (Windows) and dnglab (Windows, Linux).
  The old built-in DNG Converter entry is removed.
- Manuals, plan, spec, settings description. Build 7.

Co-Authored-By: Claude Opus 5.5 <noreply@anthropic.com>
</commit_message>
<xml_diff>
--- a/GitHub/docs/User_Manual.docx
+++ b/GitHub/docs/User_Manual.docx
@@ -7177,7 +7177,36 @@
         <w:pStyle w:val="FirstParagraph"/>
       </w:pPr>
       <w:r>
-        <w:t xml:space="preserve">Lists the built-in plug-ins and any plug-in libraries found.</w:t>
+        <w:t xml:space="preserve">Lists the built-in plug-ins, the program plug-ins and the plug-in libraries found, in the order they run (</w:t>
+      </w:r>
+      <w:r>
+        <w:rPr>
+          <w:b/>
+          <w:bCs/>
+        </w:rPr>
+        <w:t xml:space="preserve">Up</w:t>
+      </w:r>
+      <w:r>
+        <w:t xml:space="preserve"> </w:t>
+      </w:r>
+      <w:r>
+        <w:t xml:space="preserve">/</w:t>
+      </w:r>
+      <w:r>
+        <w:t xml:space="preserve"> </w:t>
+      </w:r>
+      <w:r>
+        <w:rPr>
+          <w:b/>
+          <w:bCs/>
+        </w:rPr>
+        <w:t xml:space="preserve">Down</w:t>
+      </w:r>
+      <w:r>
+        <w:t xml:space="preserve"> </w:t>
+      </w:r>
+      <w:r>
+        <w:t xml:space="preserve">change it).</w:t>
       </w:r>
       <w:r>
         <w:t xml:space="preserve"> </w:t>
@@ -7193,7 +7222,39 @@
         <w:t xml:space="preserve"> </w:t>
       </w:r>
       <w:r>
-        <w:t xml:space="preserve">works. The other built-in ones (JPEG auto profile, DNG Converter, JPEG resolution) are listed only and do nothing yet. The old Backup plug-in has been removed; backups are set with the backup folder on the Download Path tab.</w:t>
+        <w:t xml:space="preserve">and</w:t>
+      </w:r>
+      <w:r>
+        <w:t xml:space="preserve"> </w:t>
+      </w:r>
+      <w:r>
+        <w:rPr>
+          <w:b/>
+          <w:bCs/>
+        </w:rPr>
+        <w:t xml:space="preserve">JPEG auto profile</w:t>
+      </w:r>
+      <w:r>
+        <w:t xml:space="preserve"> </w:t>
+      </w:r>
+      <w:r>
+        <w:t xml:space="preserve">work;</w:t>
+      </w:r>
+      <w:r>
+        <w:t xml:space="preserve"> </w:t>
+      </w:r>
+      <w:r>
+        <w:rPr>
+          <w:b/>
+          <w:bCs/>
+        </w:rPr>
+        <w:t xml:space="preserve">JPEG resolution</w:t>
+      </w:r>
+      <w:r>
+        <w:t xml:space="preserve"> </w:t>
+      </w:r>
+      <w:r>
+        <w:t xml:space="preserve">is listed only and does nothing yet. The old Backup and DNG Converter entries have been removed (DNG conversion is now a program plug-in, see below).</w:t>
       </w:r>
     </w:p>
     <w:p>
@@ -7205,13 +7266,285 @@
           <w:b/>
           <w:bCs/>
         </w:rPr>
+        <w:t xml:space="preserve">Plug-in steps after each file.</w:t>
+      </w:r>
+      <w:r>
+        <w:t xml:space="preserve"> </w:t>
+      </w:r>
+      <w:r>
+        <w:t xml:space="preserve">After a file is copied, verified, backed up and turned upright, the switched-on plug-ins work on the</w:t>
+      </w:r>
+      <w:r>
+        <w:t xml:space="preserve"> </w:t>
+      </w:r>
+      <w:r>
+        <w:rPr>
+          <w:b/>
+          <w:bCs/>
+        </w:rPr>
+        <w:t xml:space="preserve">downloaded copy</w:t>
+      </w:r>
+      <w:r>
+        <w:t xml:space="preserve">, in list order. The backup copy and the original on the card are never changed. If a step fails, the plug-in is switched off (switch it on again after fixing the cause), the file is not offered for deletion from the card, and a message at the end of the download lists what failed. Every step is written to the log (Help &gt; Logging).</w:t>
+      </w:r>
+    </w:p>
+    <w:p>
+      <w:pPr>
+        <w:pStyle w:val="BodyText"/>
+      </w:pPr>
+      <w:r>
+        <w:rPr>
+          <w:b/>
+          <w:bCs/>
+        </w:rPr>
+        <w:t xml:space="preserve">JPEG auto profile.</w:t>
+      </w:r>
+      <w:r>
+        <w:t xml:space="preserve"> </w:t>
+      </w:r>
+      <w:r>
+        <w:t xml:space="preserve">Embeds an ICC color profile into each downloaded JPEG, without recompressing the picture.</w:t>
+      </w:r>
+      <w:r>
+        <w:t xml:space="preserve"> </w:t>
+      </w:r>
+      <w:r>
+        <w:rPr>
+          <w:b/>
+          <w:bCs/>
+        </w:rPr>
+        <w:t xml:space="preserve">Setup…</w:t>
+      </w:r>
+      <w:r>
+        <w:t xml:space="preserve"> </w:t>
+      </w:r>
+      <w:r>
+        <w:t xml:space="preserve">chooses a profile for each camera model (</w:t>
+      </w:r>
+      <w:r>
+        <w:rPr>
+          <w:b/>
+          <w:bCs/>
+        </w:rPr>
+        <w:t xml:space="preserve">Add…</w:t>
+      </w:r>
+      <w:r>
+        <w:t xml:space="preserve"> </w:t>
+      </w:r>
+      <w:r>
+        <w:t xml:space="preserve">suggests the camera of the pictures shown; the name must match the camera model in the EXIF data) and a</w:t>
+      </w:r>
+      <w:r>
+        <w:t xml:space="preserve"> </w:t>
+      </w:r>
+      <w:r>
+        <w:rPr>
+          <w:b/>
+          <w:bCs/>
+        </w:rPr>
+        <w:t xml:space="preserve">default</w:t>
+      </w:r>
+      <w:r>
+        <w:t xml:space="preserve"> </w:t>
+      </w:r>
+      <w:r>
+        <w:t xml:space="preserve">profile for all other cameras. JPEGs that already carry a profile are left alone unless</w:t>
+      </w:r>
+      <w:r>
+        <w:t xml:space="preserve"> </w:t>
+      </w:r>
+      <w:r>
+        <w:rPr>
+          <w:b/>
+          <w:bCs/>
+        </w:rPr>
+        <w:t xml:space="preserve">Replace a profile the camera already embedded</w:t>
+      </w:r>
+      <w:r>
+        <w:t xml:space="preserve"> </w:t>
+      </w:r>
+      <w:r>
+        <w:t xml:space="preserve">is ticked. Windows keeps its profiles in</w:t>
+      </w:r>
+      <w:r>
+        <w:t xml:space="preserve"> </w:t>
+      </w:r>
+      <w:r>
+        <w:rPr>
+          <w:rStyle w:val="VerbatimChar"/>
+        </w:rPr>
+        <w:t xml:space="preserve">C:\Windows\System32\spool\drivers\color</w:t>
+      </w:r>
+      <w:r>
+        <w:t xml:space="preserve">, Linux usually in</w:t>
+      </w:r>
+      <w:r>
+        <w:t xml:space="preserve"> </w:t>
+      </w:r>
+      <w:r>
+        <w:rPr>
+          <w:rStyle w:val="VerbatimChar"/>
+        </w:rPr>
+        <w:t xml:space="preserve">/usr/share/color/icc</w:t>
+      </w:r>
+      <w:r>
+        <w:t xml:space="preserve">.</w:t>
+      </w:r>
+    </w:p>
+    <w:p>
+      <w:pPr>
+        <w:pStyle w:val="BodyText"/>
+      </w:pPr>
+      <w:r>
+        <w:rPr>
+          <w:b/>
+          <w:bCs/>
+        </w:rPr>
+        <w:t xml:space="preserve">Program plug-ins (DNG Converter).</w:t>
+      </w:r>
+      <w:r>
+        <w:t xml:space="preserve"> </w:t>
+      </w:r>
+      <w:r>
+        <w:t xml:space="preserve">A program plug-in is a small</w:t>
+      </w:r>
+      <w:r>
+        <w:t xml:space="preserve"> </w:t>
+      </w:r>
+      <w:r>
+        <w:rPr>
+          <w:rStyle w:val="VerbatimChar"/>
+        </w:rPr>
+        <w:t xml:space="preserve">.plugin.ini</w:t>
+      </w:r>
+      <w:r>
+        <w:t xml:space="preserve"> </w:t>
+      </w:r>
+      <w:r>
+        <w:t xml:space="preserve">file that tells Photo Downloader which program to run on each downloaded file. Two are included in the</w:t>
+      </w:r>
+      <w:r>
+        <w:t xml:space="preserve"> </w:t>
+      </w:r>
+      <w:r>
+        <w:rPr>
+          <w:rStyle w:val="VerbatimChar"/>
+        </w:rPr>
+        <w:t xml:space="preserve">plugins\dng-converter</w:t>
+      </w:r>
+      <w:r>
+        <w:t xml:space="preserve"> </w:t>
+      </w:r>
+      <w:r>
+        <w:t xml:space="preserve">folder of the download:</w:t>
+      </w:r>
+      <w:r>
+        <w:t xml:space="preserve"> </w:t>
+      </w:r>
+      <w:r>
+        <w:rPr>
+          <w:b/>
+          <w:bCs/>
+        </w:rPr>
+        <w:t xml:space="preserve">DNG Converter (Adobe)</w:t>
+      </w:r>
+      <w:r>
+        <w:t xml:space="preserve"> </w:t>
+      </w:r>
+      <w:r>
+        <w:t xml:space="preserve">for the free Adobe DNG Converter (Windows) and</w:t>
+      </w:r>
+      <w:r>
+        <w:t xml:space="preserve"> </w:t>
+      </w:r>
+      <w:r>
+        <w:rPr>
+          <w:b/>
+          <w:bCs/>
+        </w:rPr>
+        <w:t xml:space="preserve">DNG Converter (dnglab)</w:t>
+      </w:r>
+      <w:r>
+        <w:t xml:space="preserve"> </w:t>
+      </w:r>
+      <w:r>
+        <w:t xml:space="preserve">for the free dnglab (Windows and Linux). Both make a</w:t>
+      </w:r>
+      <w:r>
+        <w:t xml:space="preserve"> </w:t>
+      </w:r>
+      <w:r>
+        <w:rPr>
+          <w:rStyle w:val="VerbatimChar"/>
+        </w:rPr>
+        <w:t xml:space="preserve">.dng</w:t>
+      </w:r>
+      <w:r>
+        <w:t xml:space="preserve"> </w:t>
+      </w:r>
+      <w:r>
+        <w:t xml:space="preserve">copy next to each raw file and keep the raw file; a DNG that already exists is not made again. To use one: install the converter, copy its</w:t>
+      </w:r>
+      <w:r>
+        <w:t xml:space="preserve"> </w:t>
+      </w:r>
+      <w:r>
+        <w:rPr>
+          <w:rStyle w:val="VerbatimChar"/>
+        </w:rPr>
+        <w:t xml:space="preserve">.plugin.ini</w:t>
+      </w:r>
+      <w:r>
+        <w:t xml:space="preserve"> </w:t>
+      </w:r>
+      <w:r>
+        <w:t xml:space="preserve">file into the</w:t>
+      </w:r>
+      <w:r>
+        <w:t xml:space="preserve"> </w:t>
+      </w:r>
+      <w:r>
+        <w:rPr>
+          <w:rStyle w:val="VerbatimChar"/>
+        </w:rPr>
+        <w:t xml:space="preserve">plugins</w:t>
+      </w:r>
+      <w:r>
+        <w:t xml:space="preserve"> </w:t>
+      </w:r>
+      <w:r>
+        <w:t xml:space="preserve">folder (below), restart Photo Downloader and switch the plug-in on (a message shows the program it will run). If the converter is installed somewhere else, choose it with</w:t>
+      </w:r>
+      <w:r>
+        <w:t xml:space="preserve"> </w:t>
+      </w:r>
+      <w:r>
+        <w:rPr>
+          <w:b/>
+          <w:bCs/>
+        </w:rPr>
+        <w:t xml:space="preserve">Setup…</w:t>
+      </w:r>
+      <w:r>
+        <w:t xml:space="preserve">. A program that runs longer than 5 minutes on one file is stopped.</w:t>
+      </w:r>
+    </w:p>
+    <w:p>
+      <w:pPr>
+        <w:pStyle w:val="BodyText"/>
+      </w:pPr>
+      <w:r>
+        <w:rPr>
+          <w:b/>
+          <w:bCs/>
+        </w:rPr>
         <w:t xml:space="preserve">Plug-in libraries.</w:t>
       </w:r>
       <w:r>
         <w:t xml:space="preserve"> </w:t>
       </w:r>
       <w:r>
-        <w:t xml:space="preserve">A plug-in library is a separate file that adds its own tokens to the folder and file name templates, for example to build folder names by an organization’s naming standard. Put the file into the</w:t>
+        <w:t xml:space="preserve">A plug-in library is a separate program file that adds its own tokens to the folder and file name templates, for example to build folder names by an organization’s naming standard. Put the file into the</w:t>
       </w:r>
       <w:r>
         <w:t xml:space="preserve"> </w:t>

</xml_diff>

<commit_message>
User Manual: where the DNG Converter plug-in files are
Co-Authored-By: Claude Opus 5.5 <noreply@anthropic.com>
</commit_message>
<xml_diff>
--- a/GitHub/docs/User_Manual.docx
+++ b/GitHub/docs/User_Manual.docx
@@ -7421,7 +7421,7 @@
         <w:t xml:space="preserve"> </w:t>
       </w:r>
       <w:r>
-        <w:t xml:space="preserve">file that tells Photo Downloader which program to run on each downloaded file. Two are included in the</w:t>
+        <w:t xml:space="preserve">file that tells Photo Downloader which program to run on each downloaded file. Two come with Photo Downloader, in the</w:t>
       </w:r>
       <w:r>
         <w:t xml:space="preserve"> </w:t>
@@ -7430,13 +7430,13 @@
         <w:rPr>
           <w:rStyle w:val="VerbatimChar"/>
         </w:rPr>
-        <w:t xml:space="preserve">plugins\dng-converter</w:t>
-      </w:r>
-      <w:r>
-        <w:t xml:space="preserve"> </w:t>
-      </w:r>
-      <w:r>
-        <w:t xml:space="preserve">folder of the download:</w:t>
+        <w:t xml:space="preserve">plugins/dng-converter</w:t>
+      </w:r>
+      <w:r>
+        <w:t xml:space="preserve"> </w:t>
+      </w:r>
+      <w:r>
+        <w:t xml:space="preserve">folder on GitHub (https://github.com/RexAlfes/Photo-Downloader/tree/main/plugins/dng-converter) and in the source bundle:</w:t>
       </w:r>
       <w:r>
         <w:t xml:space="preserve"> </w:t>

</xml_diff>

<commit_message>
Program plug-ins: find a bare program name next to the .plugin.ini
dnglab unzipped into its own folder gave "program not found" because a bare
name was only looked up on the PATH. ProgramPath now also looks in the folder
of the .plugin.ini file and its direct subfolders. Build number 9.

Co-Authored-By: Claude Opus 5.5 <noreply@anthropic.com>
</commit_message>
<xml_diff>
--- a/GitHub/docs/User_Manual.docx
+++ b/GitHub/docs/User_Manual.docx
@@ -7514,6 +7514,79 @@
       </w:r>
       <w:r>
         <w:t xml:space="preserve">folder (below), restart Photo Downloader and switch the plug-in on (a message shows the program it will run). If the converter is installed somewhere else, choose it with</w:t>
+      </w:r>
+      <w:r>
+        <w:t xml:space="preserve"> </w:t>
+      </w:r>
+      <w:r>
+        <w:rPr>
+          <w:b/>
+          <w:bCs/>
+        </w:rPr>
+        <w:t xml:space="preserve">Setup…</w:t>
+      </w:r>
+      <w:r>
+        <w:t xml:space="preserve">. dnglab needs no installing: unzip it into the</w:t>
+      </w:r>
+      <w:r>
+        <w:t xml:space="preserve"> </w:t>
+      </w:r>
+      <w:r>
+        <w:rPr>
+          <w:rStyle w:val="VerbatimChar"/>
+        </w:rPr>
+        <w:t xml:space="preserve">plugins</w:t>
+      </w:r>
+      <w:r>
+        <w:t xml:space="preserve"> </w:t>
+      </w:r>
+      <w:r>
+        <w:t xml:space="preserve">folder next to</w:t>
+      </w:r>
+      <w:r>
+        <w:t xml:space="preserve"> </w:t>
+      </w:r>
+      <w:r>
+        <w:rPr>
+          <w:rStyle w:val="VerbatimChar"/>
+        </w:rPr>
+        <w:t xml:space="preserve">dnglab.plugin.ini</w:t>
+      </w:r>
+      <w:r>
+        <w:t xml:space="preserve"> </w:t>
+      </w:r>
+      <w:r>
+        <w:t xml:space="preserve">(a subfolder such as</w:t>
+      </w:r>
+      <w:r>
+        <w:t xml:space="preserve"> </w:t>
+      </w:r>
+      <w:r>
+        <w:rPr>
+          <w:rStyle w:val="VerbatimChar"/>
+        </w:rPr>
+        <w:t xml:space="preserve">dnglab-win-x64_v0.8.0</w:t>
+      </w:r>
+      <w:r>
+        <w:t xml:space="preserve"> </w:t>
+      </w:r>
+      <w:r>
+        <w:t xml:space="preserve">is fine) and it is found; otherwise choose</w:t>
+      </w:r>
+      <w:r>
+        <w:t xml:space="preserve"> </w:t>
+      </w:r>
+      <w:r>
+        <w:rPr>
+          <w:rStyle w:val="VerbatimChar"/>
+        </w:rPr>
+        <w:t xml:space="preserve">dnglab.exe</w:t>
+      </w:r>
+      <w:r>
+        <w:t xml:space="preserve"> </w:t>
+      </w:r>
+      <w:r>
+        <w:t xml:space="preserve">with</w:t>
       </w:r>
       <w:r>
         <w:t xml:space="preserve"> </w:t>

</xml_diff>

<commit_message>
Docs: explain what the Directory Maker plug-in does
User Manual: a Directory Maker paragraph with an example and the note that
tokens cannot make empty folders. Specification and Settings File: what the
option holds and where the folders are made.

Co-Authored-By: Claude Opus 5.5 <noreply@anthropic.com>
</commit_message>
<xml_diff>
--- a/GitHub/docs/User_Manual.docx
+++ b/GitHub/docs/User_Manual.docx
@@ -7286,6 +7286,200 @@
       </w:r>
       <w:r>
         <w:t xml:space="preserve">, in list order. The backup copy and the original on the card are never changed. If a step fails, the plug-in is switched off (switch it on again after fixing the cause), the file is not offered for deletion from the card, and a message at the end of the download lists what failed. Every step is written to the log (Help &gt; Logging).</w:t>
+      </w:r>
+    </w:p>
+    <w:p>
+      <w:pPr>
+        <w:pStyle w:val="BodyText"/>
+      </w:pPr>
+      <w:r>
+        <w:rPr>
+          <w:b/>
+          <w:bCs/>
+        </w:rPr>
+        <w:t xml:space="preserve">Directory Maker.</w:t>
+      </w:r>
+      <w:r>
+        <w:t xml:space="preserve"> </w:t>
+      </w:r>
+      <w:r>
+        <w:t xml:space="preserve">Creates empty working folders for each job, for example</w:t>
+      </w:r>
+      <w:r>
+        <w:t xml:space="preserve"> </w:t>
+      </w:r>
+      <w:r>
+        <w:rPr>
+          <w:rStyle w:val="VerbatimChar"/>
+        </w:rPr>
+        <w:t xml:space="preserve">Edit</w:t>
+      </w:r>
+      <w:r>
+        <w:t xml:space="preserve">,</w:t>
+      </w:r>
+      <w:r>
+        <w:t xml:space="preserve"> </w:t>
+      </w:r>
+      <w:r>
+        <w:rPr>
+          <w:rStyle w:val="VerbatimChar"/>
+        </w:rPr>
+        <w:t xml:space="preserve">Web</w:t>
+      </w:r>
+      <w:r>
+        <w:t xml:space="preserve"> </w:t>
+      </w:r>
+      <w:r>
+        <w:t xml:space="preserve">or</w:t>
+      </w:r>
+      <w:r>
+        <w:t xml:space="preserve"> </w:t>
+      </w:r>
+      <w:r>
+        <w:rPr>
+          <w:rStyle w:val="VerbatimChar"/>
+        </w:rPr>
+        <w:t xml:space="preserve">Selects</w:t>
+      </w:r>
+      <w:r>
+        <w:t xml:space="preserve">, so they are ready when you start editing.</w:t>
+      </w:r>
+      <w:r>
+        <w:t xml:space="preserve"> </w:t>
+      </w:r>
+      <w:r>
+        <w:rPr>
+          <w:b/>
+          <w:bCs/>
+        </w:rPr>
+        <w:t xml:space="preserve">Setup…</w:t>
+      </w:r>
+      <w:r>
+        <w:t xml:space="preserve"> </w:t>
+      </w:r>
+      <w:r>
+        <w:t xml:space="preserve">asks for the folder names, separated by commas (</w:t>
+      </w:r>
+      <w:r>
+        <w:rPr>
+          <w:rStyle w:val="VerbatimChar"/>
+        </w:rPr>
+        <w:t xml:space="preserve">Edit, Web</w:t>
+      </w:r>
+      <w:r>
+        <w:t xml:space="preserve">). After each downloaded file the folders are created</w:t>
+      </w:r>
+      <w:r>
+        <w:t xml:space="preserve"> </w:t>
+      </w:r>
+      <w:r>
+        <w:rPr>
+          <w:b/>
+          <w:bCs/>
+        </w:rPr>
+        <w:t xml:space="preserve">next to the download folder</w:t>
+      </w:r>
+      <w:r>
+        <w:t xml:space="preserve">, that is in the folder one level above it; folders that already exist are left alone and nothing is put into them. Example: with the download folder</w:t>
+      </w:r>
+      <w:r>
+        <w:t xml:space="preserve"> </w:t>
+      </w:r>
+      <w:r>
+        <w:rPr>
+          <w:rStyle w:val="VerbatimChar"/>
+        </w:rPr>
+        <w:t xml:space="preserve">Photos\2026\2026-10-29_Wedding\RAW\</w:t>
+      </w:r>
+      <w:r>
+        <w:t xml:space="preserve"> </w:t>
+      </w:r>
+      <w:r>
+        <w:t xml:space="preserve">and the names</w:t>
+      </w:r>
+      <w:r>
+        <w:t xml:space="preserve"> </w:t>
+      </w:r>
+      <w:r>
+        <w:rPr>
+          <w:rStyle w:val="VerbatimChar"/>
+        </w:rPr>
+        <w:t xml:space="preserve">Edit, Web</w:t>
+      </w:r>
+      <w:r>
+        <w:t xml:space="preserve">, Directory Maker creates</w:t>
+      </w:r>
+      <w:r>
+        <w:t xml:space="preserve"> </w:t>
+      </w:r>
+      <w:r>
+        <w:rPr>
+          <w:rStyle w:val="VerbatimChar"/>
+        </w:rPr>
+        <w:t xml:space="preserve">Photos\2026\2026-10-29_Wedding\Edit\</w:t>
+      </w:r>
+      <w:r>
+        <w:t xml:space="preserve"> </w:t>
+      </w:r>
+      <w:r>
+        <w:t xml:space="preserve">and</w:t>
+      </w:r>
+      <w:r>
+        <w:t xml:space="preserve"> </w:t>
+      </w:r>
+      <w:r>
+        <w:rPr>
+          <w:rStyle w:val="VerbatimChar"/>
+        </w:rPr>
+        <w:t xml:space="preserve">Photos\2026\2026-10-29_Wedding\Web\</w:t>
+      </w:r>
+      <w:r>
+        <w:t xml:space="preserve">. Tokens cannot do this: a token only names a folder that a file is copied into. Give the download path at least one folder level below the job folder (such as</w:t>
+      </w:r>
+      <w:r>
+        <w:t xml:space="preserve"> </w:t>
+      </w:r>
+      <w:r>
+        <w:rPr>
+          <w:rStyle w:val="VerbatimChar"/>
+        </w:rPr>
+        <w:t xml:space="preserve">RAW</w:t>
+      </w:r>
+      <w:r>
+        <w:t xml:space="preserve"> </w:t>
+      </w:r>
+      <w:r>
+        <w:t xml:space="preserve">above); with only</w:t>
+      </w:r>
+      <w:r>
+        <w:t xml:space="preserve"> </w:t>
+      </w:r>
+      <w:r>
+        <w:rPr>
+          <w:rStyle w:val="VerbatimChar"/>
+        </w:rPr>
+        <w:t xml:space="preserve">Photos\{J}\</w:t>
+      </w:r>
+      <w:r>
+        <w:t xml:space="preserve"> </w:t>
+      </w:r>
+      <w:r>
+        <w:t xml:space="preserve">the folders would be made once in</w:t>
+      </w:r>
+      <w:r>
+        <w:t xml:space="preserve"> </w:t>
+      </w:r>
+      <w:r>
+        <w:rPr>
+          <w:rStyle w:val="VerbatimChar"/>
+        </w:rPr>
+        <w:t xml:space="preserve">Photos\</w:t>
+      </w:r>
+      <w:r>
+        <w:t xml:space="preserve"> </w:t>
+      </w:r>
+      <w:r>
+        <w:t xml:space="preserve">and shared by every job.</w:t>
       </w:r>
     </w:p>
     <w:p>

</xml_diff>

<commit_message>
Plug-ins tab: Install... and Remove buttons; switched-off plug-ins in gray
Install... copies a .plugin.ini or a plug-in library into the plugins folder
next to the settings file and lists it switched off. Remove deletes the file
of an installed plug-in (a library is unloaded first; its settings are kept).
Built-in plug-ins cannot be installed or removed. The list is owner-drawn:
switched-on plug-ins in black, switched-off ones in gray. Build number 10.
Compiled on Windows, not yet run-tested.

Co-Authored-By: Claude Opus 5.5 <noreply@anthropic.com>
</commit_message>
<xml_diff>
--- a/GitHub/docs/User_Manual.docx
+++ b/GitHub/docs/User_Manual.docx
@@ -7206,7 +7206,109 @@
         <w:t xml:space="preserve"> </w:t>
       </w:r>
       <w:r>
-        <w:t xml:space="preserve">change it).</w:t>
+        <w:t xml:space="preserve">change it). Switched-on plug-ins are shown in black, switched-off ones in gray.</w:t>
+      </w:r>
+      <w:r>
+        <w:t xml:space="preserve"> </w:t>
+      </w:r>
+      <w:r>
+        <w:rPr>
+          <w:b/>
+          <w:bCs/>
+        </w:rPr>
+        <w:t xml:space="preserve">Install…</w:t>
+      </w:r>
+      <w:r>
+        <w:t xml:space="preserve"> </w:t>
+      </w:r>
+      <w:r>
+        <w:t xml:space="preserve">adds a program plug-in (a</w:t>
+      </w:r>
+      <w:r>
+        <w:t xml:space="preserve"> </w:t>
+      </w:r>
+      <w:r>
+        <w:rPr>
+          <w:rStyle w:val="VerbatimChar"/>
+        </w:rPr>
+        <w:t xml:space="preserve">.plugin.ini</w:t>
+      </w:r>
+      <w:r>
+        <w:t xml:space="preserve"> </w:t>
+      </w:r>
+      <w:r>
+        <w:t xml:space="preserve">file) or a plug-in library (</w:t>
+      </w:r>
+      <w:r>
+        <w:rPr>
+          <w:rStyle w:val="VerbatimChar"/>
+        </w:rPr>
+        <w:t xml:space="preserve">.dll</w:t>
+      </w:r>
+      <w:r>
+        <w:t xml:space="preserve"> </w:t>
+      </w:r>
+      <w:r>
+        <w:t xml:space="preserve">on Windows,</w:t>
+      </w:r>
+      <w:r>
+        <w:t xml:space="preserve"> </w:t>
+      </w:r>
+      <w:r>
+        <w:rPr>
+          <w:rStyle w:val="VerbatimChar"/>
+        </w:rPr>
+        <w:t xml:space="preserve">.so</w:t>
+      </w:r>
+      <w:r>
+        <w:t xml:space="preserve"> </w:t>
+      </w:r>
+      <w:r>
+        <w:t xml:space="preserve">on Linux): it copies the chosen file into the</w:t>
+      </w:r>
+      <w:r>
+        <w:t xml:space="preserve"> </w:t>
+      </w:r>
+      <w:r>
+        <w:rPr>
+          <w:rStyle w:val="VerbatimChar"/>
+        </w:rPr>
+        <w:t xml:space="preserve">plugins</w:t>
+      </w:r>
+      <w:r>
+        <w:t xml:space="preserve"> </w:t>
+      </w:r>
+      <w:r>
+        <w:t xml:space="preserve">folder next to the settings file and lists it switched off, so nothing of it runs until you tick</w:t>
+      </w:r>
+      <w:r>
+        <w:t xml:space="preserve"> </w:t>
+      </w:r>
+      <w:r>
+        <w:rPr>
+          <w:b/>
+          <w:bCs/>
+        </w:rPr>
+        <w:t xml:space="preserve">Enable plug-in</w:t>
+      </w:r>
+      <w:r>
+        <w:t xml:space="preserve">. Installing a file that is already there replaces it (after a question) and switches it off.</w:t>
+      </w:r>
+      <w:r>
+        <w:t xml:space="preserve"> </w:t>
+      </w:r>
+      <w:r>
+        <w:rPr>
+          <w:b/>
+          <w:bCs/>
+        </w:rPr>
+        <w:t xml:space="preserve">Remove</w:t>
+      </w:r>
+      <w:r>
+        <w:t xml:space="preserve"> </w:t>
+      </w:r>
+      <w:r>
+        <w:t xml:space="preserve">deletes the file of the selected plug-in after a question; a library is unloaded first. Its settings are kept, so they are back if you install it again, and the program a program plug-in runs (for example the DNG converter) is not removed. Built-in plug-ins (Directory Maker, JPEG auto profile, JPEG resolution) are part of the program: they cannot be installed or removed, only switched off.</w:t>
       </w:r>
       <w:r>
         <w:t xml:space="preserve"> </w:t>
@@ -7677,7 +7779,23 @@
         <w:t xml:space="preserve"> </w:t>
       </w:r>
       <w:r>
-        <w:t xml:space="preserve">copy next to each raw file and keep the raw file; a DNG that already exists is not made again. To use one: install the converter, copy its</w:t>
+        <w:t xml:space="preserve">copy next to each raw file and keep the raw file; a DNG that already exists is not made again. To use one: install the converter, click</w:t>
+      </w:r>
+      <w:r>
+        <w:t xml:space="preserve"> </w:t>
+      </w:r>
+      <w:r>
+        <w:rPr>
+          <w:b/>
+          <w:bCs/>
+        </w:rPr>
+        <w:t xml:space="preserve">Install…</w:t>
+      </w:r>
+      <w:r>
+        <w:t xml:space="preserve"> </w:t>
+      </w:r>
+      <w:r>
+        <w:t xml:space="preserve">on the Plug-ins tab and choose its</w:t>
       </w:r>
       <w:r>
         <w:t xml:space="preserve"> </w:t>
@@ -7692,7 +7810,7 @@
         <w:t xml:space="preserve"> </w:t>
       </w:r>
       <w:r>
-        <w:t xml:space="preserve">file into the</w:t>
+        <w:t xml:space="preserve">file (or copy the file into the</w:t>
       </w:r>
       <w:r>
         <w:t xml:space="preserve"> </w:t>
@@ -7707,7 +7825,7 @@
         <w:t xml:space="preserve"> </w:t>
       </w:r>
       <w:r>
-        <w:t xml:space="preserve">folder (below), restart Photo Downloader and switch the plug-in on (a message shows the program it will run). If the converter is installed somewhere else, choose it with</w:t>
+        <w:t xml:space="preserve">folder, below, and restart Photo Downloader), then switch the plug-in on (a message shows the program it will run). If the converter is installed somewhere else, choose it with</w:t>
       </w:r>
       <w:r>
         <w:t xml:space="preserve"> </w:t>
@@ -7811,7 +7929,23 @@
         <w:t xml:space="preserve"> </w:t>
       </w:r>
       <w:r>
-        <w:t xml:space="preserve">A plug-in library is a separate program file that adds its own tokens to the folder and file name templates, for example to build folder names by an organization’s naming standard. Put the file into the</w:t>
+        <w:t xml:space="preserve">A plug-in library is a separate program file that adds its own tokens to the folder and file name templates, for example to build folder names by an organization’s naming standard. Install it with</w:t>
+      </w:r>
+      <w:r>
+        <w:t xml:space="preserve"> </w:t>
+      </w:r>
+      <w:r>
+        <w:rPr>
+          <w:b/>
+          <w:bCs/>
+        </w:rPr>
+        <w:t xml:space="preserve">Install…</w:t>
+      </w:r>
+      <w:r>
+        <w:t xml:space="preserve"> </w:t>
+      </w:r>
+      <w:r>
+        <w:t xml:space="preserve">on the Plug-ins tab, or put the file into the</w:t>
       </w:r>
       <w:r>
         <w:t xml:space="preserve"> </w:t>
@@ -7826,7 +7960,7 @@
         <w:t xml:space="preserve"> </w:t>
       </w:r>
       <w:r>
-        <w:t xml:space="preserve">folder:</w:t>
+        <w:t xml:space="preserve">folder yourself:</w:t>
       </w:r>
     </w:p>
     <w:p>
@@ -7930,7 +8064,20 @@
         <w:pStyle w:val="FirstParagraph"/>
       </w:pPr>
       <w:r>
-        <w:t xml:space="preserve">The next time the program starts, the library appears in the list as</w:t>
+        <w:t xml:space="preserve">After</w:t>
+      </w:r>
+      <w:r>
+        <w:t xml:space="preserve"> </w:t>
+      </w:r>
+      <w:r>
+        <w:rPr>
+          <w:b/>
+          <w:bCs/>
+        </w:rPr>
+        <w:t xml:space="preserve">Install…</w:t>
+      </w:r>
+      <w:r>
+        <w:t xml:space="preserve">, or the next time the program starts, the library appears in the list as</w:t>
       </w:r>
       <w:r>
         <w:t xml:space="preserve"> </w:t>
@@ -7972,7 +8119,23 @@
         <w:t xml:space="preserve"> </w:t>
       </w:r>
       <w:r>
-        <w:t xml:space="preserve">only when you trust where the file came from, because a library runs with your rights. If a library cannot be loaded (for example a 32-bit or a Linux file on Windows), the program says why and switches it off. To remove a plug-in, delete its file from the</w:t>
+        <w:t xml:space="preserve">only when you trust where the file came from, because a library runs with your rights. If a library cannot be loaded (for example a 32-bit or a Linux file on Windows), the program says why and switches it off. To remove a plug-in, select it and click</w:t>
+      </w:r>
+      <w:r>
+        <w:t xml:space="preserve"> </w:t>
+      </w:r>
+      <w:r>
+        <w:rPr>
+          <w:b/>
+          <w:bCs/>
+        </w:rPr>
+        <w:t xml:space="preserve">Remove</w:t>
+      </w:r>
+      <w:r>
+        <w:t xml:space="preserve"> </w:t>
+      </w:r>
+      <w:r>
+        <w:t xml:space="preserve">(or delete its file from the</w:t>
       </w:r>
       <w:r>
         <w:t xml:space="preserve"> </w:t>
@@ -7987,7 +8150,7 @@
         <w:t xml:space="preserve"> </w:t>
       </w:r>
       <w:r>
-        <w:t xml:space="preserve">folder: at the next start it leaves the list. Its values are kept, so they are back if you install it again.</w:t>
+        <w:t xml:space="preserve">folder; at the next start it leaves the list). Its values are kept, so they are back if you install it again.</w:t>
       </w:r>
     </w:p>
     <w:p>

</xml_diff>

<commit_message>
Plug-ins list: show the version after the name
Libraries show the Version= from pd_info once loaded, program plug-ins the
Version= of their .plugin.ini. Build number 11. Compiled on Windows, not yet
run-tested.

Co-Authored-By: Claude Opus 5.5 <noreply@anthropic.com>
</commit_message>
<xml_diff>
--- a/GitHub/docs/User_Manual.docx
+++ b/GitHub/docs/User_Manual.docx
@@ -7206,7 +7206,7 @@
         <w:t xml:space="preserve"> </w:t>
       </w:r>
       <w:r>
-        <w:t xml:space="preserve">change it). Switched-on plug-ins are shown in black, switched-off ones in gray.</w:t>
+        <w:t xml:space="preserve">change it). Switched-on plug-ins are shown in black, switched-off ones in gray. Program plug-ins and plug-in libraries show their version after the name (a library only once it is switched on, because the version comes from the library itself).</w:t>
       </w:r>
       <w:r>
         <w:t xml:space="preserve"> </w:t>
@@ -8158,7 +8158,7 @@
         <w:pStyle w:val="BodyText"/>
       </w:pPr>
       <w:r>
-        <w:t xml:space="preserve">Once it is switched on, the list shows the library’s own name, the information below the list names its tokens, and its logo (if it has one) is shown.</w:t>
+        <w:t xml:space="preserve">Once it is switched on, the list shows the library’s own name and version, the information below the list names its tokens, and its logo (if it has one) is shown.</w:t>
       </w:r>
       <w:r>
         <w:t xml:space="preserve"> </w:t>

</xml_diff>

<commit_message>
JPEG resolution plug-in: set the DPI or dots/cm of downloaded JPEGs
New unit uJpegDpi.pas writes the resolution into the EXIF data and the JFIF
header without touching the image data (a JFIF header is added when the file
has neither). Setup... asks for the value and the unit (default 300 dpi).
Build number 12. Unit-tested on Windows; not yet run-tested in the program.

Co-Authored-By: Claude Opus 5.5 <noreply@anthropic.com>
</commit_message>
<xml_diff>
--- a/GitHub/docs/User_Manual.docx
+++ b/GitHub/docs/User_Manual.docx
@@ -7308,7 +7308,7 @@
         <w:t xml:space="preserve"> </w:t>
       </w:r>
       <w:r>
-        <w:t xml:space="preserve">deletes the file of the selected plug-in after a question; a library is unloaded first. Its settings are kept, so they are back if you install it again, and the program a program plug-in runs (for example the DNG converter) is not removed. Built-in plug-ins (Directory Maker, JPEG auto profile, JPEG resolution) are part of the program: they cannot be installed or removed, only switched off.</w:t>
+        <w:t xml:space="preserve">deletes the file of the selected plug-in after a question; a library is unloaded first. Its settings are kept, so they are back if you install it again, and the program a program plug-in runs (for example the DNG converter) is not removed. Built-in plug-ins (Directory Maker, JPEG auto profile, JPEG resolution) are part of the program: they cannot be installed or removed, only switched off. All three built-in plug-ins work:</w:t>
       </w:r>
       <w:r>
         <w:t xml:space="preserve"> </w:t>
@@ -7321,6 +7321,19 @@
         <w:t xml:space="preserve">Directory Maker</w:t>
       </w:r>
       <w:r>
+        <w:t xml:space="preserve">,</w:t>
+      </w:r>
+      <w:r>
+        <w:t xml:space="preserve"> </w:t>
+      </w:r>
+      <w:r>
+        <w:rPr>
+          <w:b/>
+          <w:bCs/>
+        </w:rPr>
+        <w:t xml:space="preserve">JPEG auto profile</w:t>
+      </w:r>
+      <w:r>
         <w:t xml:space="preserve"> </w:t>
       </w:r>
       <w:r>
@@ -7334,29 +7347,10 @@
           <w:b/>
           <w:bCs/>
         </w:rPr>
-        <w:t xml:space="preserve">JPEG auto profile</w:t>
-      </w:r>
-      <w:r>
-        <w:t xml:space="preserve"> </w:t>
-      </w:r>
-      <w:r>
-        <w:t xml:space="preserve">work;</w:t>
-      </w:r>
-      <w:r>
-        <w:t xml:space="preserve"> </w:t>
-      </w:r>
-      <w:r>
-        <w:rPr>
-          <w:b/>
-          <w:bCs/>
-        </w:rPr>
         <w:t xml:space="preserve">JPEG resolution</w:t>
       </w:r>
       <w:r>
-        <w:t xml:space="preserve"> </w:t>
-      </w:r>
-      <w:r>
-        <w:t xml:space="preserve">is listed only and does nothing yet. The old Backup and DNG Converter entries have been removed (DNG conversion is now a program plug-in, see below).</w:t>
+        <w:t xml:space="preserve">. The old Backup and DNG Converter entries have been removed (DNG conversion is now a program plug-in, see below).</w:t>
       </w:r>
     </w:p>
     <w:p>
@@ -7582,6 +7576,40 @@
       </w:r>
       <w:r>
         <w:t xml:space="preserve">and shared by every job.</w:t>
+      </w:r>
+    </w:p>
+    <w:p>
+      <w:pPr>
+        <w:pStyle w:val="BodyText"/>
+      </w:pPr>
+      <w:r>
+        <w:rPr>
+          <w:b/>
+          <w:bCs/>
+        </w:rPr>
+        <w:t xml:space="preserve">JPEG resolution.</w:t>
+      </w:r>
+      <w:r>
+        <w:t xml:space="preserve"> </w:t>
+      </w:r>
+      <w:r>
+        <w:t xml:space="preserve">Adjusts the DPI of downloaded JPEGs. The resolution can be specified in DPI or dots/cm:</w:t>
+      </w:r>
+      <w:r>
+        <w:t xml:space="preserve"> </w:t>
+      </w:r>
+      <w:r>
+        <w:rPr>
+          <w:b/>
+          <w:bCs/>
+        </w:rPr>
+        <w:t xml:space="preserve">Setup…</w:t>
+      </w:r>
+      <w:r>
+        <w:t xml:space="preserve"> </w:t>
+      </w:r>
+      <w:r>
+        <w:t xml:space="preserve">asks for the value and the unit (switching the unit converts the value, for example 300 dpi to 118.11 dots/cm); without a setup it uses 300 dpi. Please note: adjusting the resolution does not affect the image data. The resolution is used by some applications (for example Photoshop and Photoshop Elements) to determine the print size. The value is written into the EXIF data (XResolution, YResolution, ResolutionUnit) and into the JFIF header when the file has one; a JPEG that has neither gets a JFIF header. Only the downloaded copy is changed, never the backup copy or the original on the card. A JPEG that has this resolution already is left alone.</w:t>
       </w:r>
     </w:p>
     <w:p>

</xml_diff>

<commit_message>
Editable plug-in lists (field flags edit, code=N); prompt window colors with 4.5:1 contrast
Build 4. A choice field with the flag edit gets an Edit list... button; the list editor (one window) keeps codes (A-Z, 0-9, exact length with code=N) and short descriptors. The edited list is stored with the values as List.<key>= and sent to pd_check and pd_token. The note and error texts are dark red and the version dark gray, for WCAG 2.1 AA contrast. Plug-in Developer Manual, User Manual, Spec, Settings_File and Continuation Prompt updated.

Co-Authored-By: Claude Opus 5.5 <noreply@anthropic.com>
</commit_message>
<xml_diff>
--- a/GitHub/docs/User_Manual.docx
+++ b/GitHub/docs/User_Manual.docx
@@ -8318,7 +8318,39 @@
         <w:t xml:space="preserve"> </w:t>
       </w:r>
       <w:r>
-        <w:t xml:space="preserve">line follows the box. The library’s version is shown in the window’s title bar. Use the library’s tokens in the templates on the Download Path tab like any other token; the</w:t>
+        <w:t xml:space="preserve">line follows the box. The library’s version is shown in the window’s title bar. A list field may have an</w:t>
+      </w:r>
+      <w:r>
+        <w:t xml:space="preserve"> </w:t>
+      </w:r>
+      <w:r>
+        <w:rPr>
+          <w:b/>
+          <w:bCs/>
+        </w:rPr>
+        <w:t xml:space="preserve">Edit list…</w:t>
+      </w:r>
+      <w:r>
+        <w:t xml:space="preserve"> </w:t>
+      </w:r>
+      <w:r>
+        <w:t xml:space="preserve">button: it opens a list editor where you add, replace, remove and reorder entries, each a short code (letters and digits; the library may require an exact length) and a short descriptor;</w:t>
+      </w:r>
+      <w:r>
+        <w:t xml:space="preserve"> </w:t>
+      </w:r>
+      <w:r>
+        <w:rPr>
+          <w:b/>
+          <w:bCs/>
+        </w:rPr>
+        <w:t xml:space="preserve">Defaults</w:t>
+      </w:r>
+      <w:r>
+        <w:t xml:space="preserve"> </w:t>
+      </w:r>
+      <w:r>
+        <w:t xml:space="preserve">brings back the library’s own list. The edited list is kept with the other values (also in user profiles). Use the library’s tokens in the templates on the Download Path tab like any other token; the</w:t>
       </w:r>
       <w:r>
         <w:t xml:space="preserve"> </w:t>

</xml_diff>

<commit_message>
Title bar shows the user profile in use
Build 5. UpdateCaption puts 'Profile: <name>' right after the program name (visible even when the source path is cut off, and on the taskbar button). Updated after the start-up profile prompt and on profile Load, Save and Delete. User Manual, Spec and Continuation Prompt updated.

Co-Authored-By: Claude Opus 5.5 <noreply@anthropic.com>
</commit_message>
<xml_diff>
--- a/GitHub/docs/User_Manual.docx
+++ b/GitHub/docs/User_Manual.docx
@@ -8531,6 +8531,44 @@
       </w:r>
       <w:r>
         <w:t xml:space="preserve">to update that profile, click another profile in the list (double-click saves at once) to save over it, or type a new name. Saving over a profile asks for confirmation first.</w:t>
+      </w:r>
+    </w:p>
+    <w:p>
+      <w:pPr>
+        <w:pStyle w:val="Compact"/>
+        <w:numPr>
+          <w:ilvl w:val="0"/>
+          <w:numId w:val="1017"/>
+        </w:numPr>
+      </w:pPr>
+      <w:r>
+        <w:rPr>
+          <w:b/>
+          <w:bCs/>
+        </w:rPr>
+        <w:t xml:space="preserve">The title bar shows the profile in use</w:t>
+      </w:r>
+      <w:r>
+        <w:t xml:space="preserve">, right after the program name, for example **Photo Downloader - Profile: Bridges - Folder E:</w:t>
+      </w:r>
+      <w:r>
+        <w:t xml:space="preserve">*. It changes when you load, save or delete a profile; without a profile in use (or after choosing</w:t>
+      </w:r>
+      <w:r>
+        <w:t xml:space="preserve"> </w:t>
+      </w:r>
+      <w:r>
+        <w:rPr>
+          <w:b/>
+          <w:bCs/>
+        </w:rPr>
+        <w:t xml:space="preserve">Default</w:t>
+      </w:r>
+      <w:r>
+        <w:t xml:space="preserve"> </w:t>
+      </w:r>
+      <w:r>
+        <w:t xml:space="preserve">at start-up) no profile is shown.</w:t>
       </w:r>
     </w:p>
     <w:p>

</xml_diff>